<commit_message>
Update Doc file to include some fo JuanMa queries and outputs
</commit_message>
<xml_diff>
--- a/SOEN363_Project_Phase1_DatabaseGuru.docx
+++ b/SOEN363_Project_Phase1_DatabaseGuru.docx
@@ -306,7 +306,95 @@
                                               <w:sz w:val="26"/>
                                               <w:szCs w:val="26"/>
                                             </w:rPr>
-                                            <w:t>Freddy, Laurent, Mohammad, Juan, Zachari</w:t>
+                                            <w:t>Freddy</w:t>
+                                          </w:r>
+                                          <w:r>
+                                            <w:rPr>
+                                              <w:color w:val="E97132" w:themeColor="accent2"/>
+                                              <w:sz w:val="26"/>
+                                              <w:szCs w:val="26"/>
+                                            </w:rPr>
+                                            <w:t xml:space="preserve"> Mvemba</w:t>
+                                          </w:r>
+                                          <w:r>
+                                            <w:rPr>
+                                              <w:color w:val="E97132" w:themeColor="accent2"/>
+                                              <w:sz w:val="26"/>
+                                              <w:szCs w:val="26"/>
+                                            </w:rPr>
+                                            <w:t>:</w:t>
+                                          </w:r>
+                                          <w:r>
+                                            <w:rPr>
+                                              <w:color w:val="E97132" w:themeColor="accent2"/>
+                                              <w:sz w:val="26"/>
+                                              <w:szCs w:val="26"/>
+                                            </w:rPr>
+                                            <w:t xml:space="preserve"> StudentID: 25745616</w:t>
+                                          </w:r>
+                                          <w:r>
+                                            <w:rPr>
+                                              <w:color w:val="E97132" w:themeColor="accent2"/>
+                                              <w:sz w:val="26"/>
+                                              <w:szCs w:val="26"/>
+                                            </w:rPr>
+                                            <w:t>, Laurent</w:t>
+                                          </w:r>
+                                          <w:r>
+                                            <w:rPr>
+                                              <w:color w:val="E97132" w:themeColor="accent2"/>
+                                              <w:sz w:val="26"/>
+                                              <w:szCs w:val="26"/>
+                                            </w:rPr>
+                                            <w:t xml:space="preserve"> StudentID:</w:t>
+                                          </w:r>
+                                          <w:r>
+                                            <w:rPr>
+                                              <w:color w:val="E97132" w:themeColor="accent2"/>
+                                              <w:sz w:val="26"/>
+                                              <w:szCs w:val="26"/>
+                                            </w:rPr>
+                                            <w:t xml:space="preserve"> Mohammad</w:t>
+                                          </w:r>
+                                          <w:r>
+                                            <w:rPr>
+                                              <w:color w:val="E97132" w:themeColor="accent2"/>
+                                              <w:sz w:val="26"/>
+                                              <w:szCs w:val="26"/>
+                                            </w:rPr>
+                                            <w:t xml:space="preserve"> StudentID</w:t>
+                                          </w:r>
+                                          <w:r>
+                                            <w:rPr>
+                                              <w:color w:val="E97132" w:themeColor="accent2"/>
+                                              <w:sz w:val="26"/>
+                                              <w:szCs w:val="26"/>
+                                            </w:rPr>
+                                            <w:t>, Juan</w:t>
+                                          </w:r>
+                                          <w:r>
+                                            <w:rPr>
+                                              <w:color w:val="E97132" w:themeColor="accent2"/>
+                                              <w:sz w:val="26"/>
+                                              <w:szCs w:val="26"/>
+                                            </w:rPr>
+                                            <w:t xml:space="preserve"> Student ID</w:t>
+                                          </w:r>
+                                          <w:r>
+                                            <w:rPr>
+                                              <w:color w:val="E97132" w:themeColor="accent2"/>
+                                              <w:sz w:val="26"/>
+                                              <w:szCs w:val="26"/>
+                                            </w:rPr>
+                                            <w:t>, Zachari</w:t>
+                                          </w:r>
+                                          <w:r>
+                                            <w:rPr>
+                                              <w:color w:val="E97132" w:themeColor="accent2"/>
+                                              <w:sz w:val="26"/>
+                                              <w:szCs w:val="26"/>
+                                            </w:rPr>
+                                            <w:t xml:space="preserve"> StudentID</w:t>
                                           </w:r>
                                         </w:p>
                                       </w:sdtContent>
@@ -598,7 +686,95 @@
                                         <w:sz w:val="26"/>
                                         <w:szCs w:val="26"/>
                                       </w:rPr>
-                                      <w:t>Freddy, Laurent, Mohammad, Juan, Zachari</w:t>
+                                      <w:t>Freddy</w:t>
+                                    </w:r>
+                                    <w:r>
+                                      <w:rPr>
+                                        <w:color w:val="E97132" w:themeColor="accent2"/>
+                                        <w:sz w:val="26"/>
+                                        <w:szCs w:val="26"/>
+                                      </w:rPr>
+                                      <w:t xml:space="preserve"> Mvemba</w:t>
+                                    </w:r>
+                                    <w:r>
+                                      <w:rPr>
+                                        <w:color w:val="E97132" w:themeColor="accent2"/>
+                                        <w:sz w:val="26"/>
+                                        <w:szCs w:val="26"/>
+                                      </w:rPr>
+                                      <w:t>:</w:t>
+                                    </w:r>
+                                    <w:r>
+                                      <w:rPr>
+                                        <w:color w:val="E97132" w:themeColor="accent2"/>
+                                        <w:sz w:val="26"/>
+                                        <w:szCs w:val="26"/>
+                                      </w:rPr>
+                                      <w:t xml:space="preserve"> StudentID: 25745616</w:t>
+                                    </w:r>
+                                    <w:r>
+                                      <w:rPr>
+                                        <w:color w:val="E97132" w:themeColor="accent2"/>
+                                        <w:sz w:val="26"/>
+                                        <w:szCs w:val="26"/>
+                                      </w:rPr>
+                                      <w:t>, Laurent</w:t>
+                                    </w:r>
+                                    <w:r>
+                                      <w:rPr>
+                                        <w:color w:val="E97132" w:themeColor="accent2"/>
+                                        <w:sz w:val="26"/>
+                                        <w:szCs w:val="26"/>
+                                      </w:rPr>
+                                      <w:t xml:space="preserve"> StudentID:</w:t>
+                                    </w:r>
+                                    <w:r>
+                                      <w:rPr>
+                                        <w:color w:val="E97132" w:themeColor="accent2"/>
+                                        <w:sz w:val="26"/>
+                                        <w:szCs w:val="26"/>
+                                      </w:rPr>
+                                      <w:t xml:space="preserve"> Mohammad</w:t>
+                                    </w:r>
+                                    <w:r>
+                                      <w:rPr>
+                                        <w:color w:val="E97132" w:themeColor="accent2"/>
+                                        <w:sz w:val="26"/>
+                                        <w:szCs w:val="26"/>
+                                      </w:rPr>
+                                      <w:t xml:space="preserve"> StudentID</w:t>
+                                    </w:r>
+                                    <w:r>
+                                      <w:rPr>
+                                        <w:color w:val="E97132" w:themeColor="accent2"/>
+                                        <w:sz w:val="26"/>
+                                        <w:szCs w:val="26"/>
+                                      </w:rPr>
+                                      <w:t>, Juan</w:t>
+                                    </w:r>
+                                    <w:r>
+                                      <w:rPr>
+                                        <w:color w:val="E97132" w:themeColor="accent2"/>
+                                        <w:sz w:val="26"/>
+                                        <w:szCs w:val="26"/>
+                                      </w:rPr>
+                                      <w:t xml:space="preserve"> Student ID</w:t>
+                                    </w:r>
+                                    <w:r>
+                                      <w:rPr>
+                                        <w:color w:val="E97132" w:themeColor="accent2"/>
+                                        <w:sz w:val="26"/>
+                                        <w:szCs w:val="26"/>
+                                      </w:rPr>
+                                      <w:t>, Zachari</w:t>
+                                    </w:r>
+                                    <w:r>
+                                      <w:rPr>
+                                        <w:color w:val="E97132" w:themeColor="accent2"/>
+                                        <w:sz w:val="26"/>
+                                        <w:szCs w:val="26"/>
+                                      </w:rPr>
+                                      <w:t xml:space="preserve"> StudentID</w:t>
                                     </w:r>
                                   </w:p>
                                 </w:sdtContent>
@@ -723,7 +899,7 @@
           <w:r>
             <w:fldChar w:fldCharType="separate"/>
           </w:r>
-          <w:hyperlink w:anchor="_Toc243036264" w:history="1">
+          <w:hyperlink w:anchor="_Toc243347143" w:history="1">
             <w:r>
               <w:rPr>
                 <w:rStyle w:val="Hyperlink"/>
@@ -750,7 +926,7 @@
                 <w:noProof/>
                 <w:webHidden/>
               </w:rPr>
-              <w:instrText xml:space="preserve"> PAGEREF _Toc243036264 \h </w:instrText>
+              <w:instrText xml:space="preserve"> PAGEREF _Toc243347143 \h </w:instrText>
             </w:r>
             <w:r>
               <w:rPr>
@@ -795,7 +971,7 @@
               <w14:ligatures w14:val="standardContextual"/>
             </w:rPr>
           </w:pPr>
-          <w:hyperlink w:anchor="_Toc243036265" w:history="1">
+          <w:hyperlink w:anchor="_Toc243347144" w:history="1">
             <w:r>
               <w:rPr>
                 <w:rStyle w:val="Hyperlink"/>
@@ -822,7 +998,7 @@
                 <w:noProof/>
                 <w:webHidden/>
               </w:rPr>
-              <w:instrText xml:space="preserve"> PAGEREF _Toc243036265 \h </w:instrText>
+              <w:instrText xml:space="preserve"> PAGEREF _Toc243347144 \h </w:instrText>
             </w:r>
             <w:r>
               <w:rPr>
@@ -867,7 +1043,7 @@
               <w14:ligatures w14:val="standardContextual"/>
             </w:rPr>
           </w:pPr>
-          <w:hyperlink w:anchor="_Toc243036266" w:history="1">
+          <w:hyperlink w:anchor="_Toc243347145" w:history="1">
             <w:r>
               <w:rPr>
                 <w:rStyle w:val="Hyperlink"/>
@@ -894,7 +1070,7 @@
                 <w:noProof/>
                 <w:webHidden/>
               </w:rPr>
-              <w:instrText xml:space="preserve"> PAGEREF _Toc243036266 \h </w:instrText>
+              <w:instrText xml:space="preserve"> PAGEREF _Toc243347145 \h </w:instrText>
             </w:r>
             <w:r>
               <w:rPr>
@@ -939,7 +1115,7 @@
               <w14:ligatures w14:val="standardContextual"/>
             </w:rPr>
           </w:pPr>
-          <w:hyperlink w:anchor="_Toc243036267" w:history="1">
+          <w:hyperlink w:anchor="_Toc243347146" w:history="1">
             <w:r>
               <w:rPr>
                 <w:rStyle w:val="Hyperlink"/>
@@ -966,7 +1142,7 @@
                 <w:noProof/>
                 <w:webHidden/>
               </w:rPr>
-              <w:instrText xml:space="preserve"> PAGEREF _Toc243036267 \h </w:instrText>
+              <w:instrText xml:space="preserve"> PAGEREF _Toc243347146 \h </w:instrText>
             </w:r>
             <w:r>
               <w:rPr>
@@ -1011,7 +1187,7 @@
               <w14:ligatures w14:val="standardContextual"/>
             </w:rPr>
           </w:pPr>
-          <w:hyperlink w:anchor="_Toc243036268" w:history="1">
+          <w:hyperlink w:anchor="_Toc243347147" w:history="1">
             <w:r>
               <w:rPr>
                 <w:rStyle w:val="Hyperlink"/>
@@ -1038,79 +1214,7 @@
                 <w:noProof/>
                 <w:webHidden/>
               </w:rPr>
-              <w:instrText xml:space="preserve"> PAGEREF _Toc243036268 \h </w:instrText>
-            </w:r>
-            <w:r>
-              <w:rPr>
-                <w:noProof/>
-                <w:webHidden/>
-              </w:rPr>
-            </w:r>
-            <w:r>
-              <w:rPr>
-                <w:noProof/>
-                <w:webHidden/>
-              </w:rPr>
-              <w:fldChar w:fldCharType="separate"/>
-            </w:r>
-            <w:r>
-              <w:rPr>
-                <w:noProof/>
-                <w:webHidden/>
-              </w:rPr>
-              <w:t>5</w:t>
-            </w:r>
-            <w:r>
-              <w:rPr>
-                <w:noProof/>
-                <w:webHidden/>
-              </w:rPr>
-              <w:fldChar w:fldCharType="end"/>
-            </w:r>
-          </w:hyperlink>
-        </w:p>
-        <w:p>
-          <w:pPr>
-            <w:pStyle w:val="TOC1"/>
-            <w:tabs>
-              <w:tab w:val="right" w:pos="9350"/>
-            </w:tabs>
-            <w:rPr>
-              <w:rFonts w:asciiTheme="minorHAnsi" w:eastAsiaTheme="minorEastAsia" w:hAnsiTheme="minorHAnsi" w:cstheme="minorBidi"/>
-              <w:noProof/>
-              <w:kern w:val="2"/>
-              <w:lang w:val="en-US"/>
-              <w14:ligatures w14:val="standardContextual"/>
-            </w:rPr>
-          </w:pPr>
-          <w:hyperlink w:anchor="_Toc243036269" w:history="1">
-            <w:r>
-              <w:rPr>
-                <w:rStyle w:val="Hyperlink"/>
-                <w:noProof/>
-              </w:rPr>
-              <w:t>Queries (Q1–Q20)</w:t>
-            </w:r>
-            <w:r>
-              <w:rPr>
-                <w:noProof/>
-                <w:webHidden/>
-              </w:rPr>
-              <w:tab/>
-            </w:r>
-            <w:r>
-              <w:rPr>
-                <w:noProof/>
-                <w:webHidden/>
-              </w:rPr>
-              <w:fldChar w:fldCharType="begin"/>
-            </w:r>
-            <w:r>
-              <w:rPr>
-                <w:noProof/>
-                <w:webHidden/>
-              </w:rPr>
-              <w:instrText xml:space="preserve"> PAGEREF _Toc243036269 \h </w:instrText>
+              <w:instrText xml:space="preserve"> PAGEREF _Toc243347147 \h </w:instrText>
             </w:r>
             <w:r>
               <w:rPr>
@@ -1155,13 +1259,13 @@
               <w14:ligatures w14:val="standardContextual"/>
             </w:rPr>
           </w:pPr>
-          <w:hyperlink w:anchor="_Toc243036270" w:history="1">
+          <w:hyperlink w:anchor="_Toc243347148" w:history="1">
             <w:r>
               <w:rPr>
                 <w:rStyle w:val="Hyperlink"/>
                 <w:noProof/>
               </w:rPr>
-              <w:t>Submitted Files</w:t>
+              <w:t>Reproduction Steps</w:t>
             </w:r>
             <w:r>
               <w:rPr>
@@ -1182,7 +1286,7 @@
                 <w:noProof/>
                 <w:webHidden/>
               </w:rPr>
-              <w:instrText xml:space="preserve"> PAGEREF _Toc243036270 \h </w:instrText>
+              <w:instrText xml:space="preserve"> PAGEREF _Toc243347148 \h </w:instrText>
             </w:r>
             <w:r>
               <w:rPr>
@@ -1227,13 +1331,13 @@
               <w14:ligatures w14:val="standardContextual"/>
             </w:rPr>
           </w:pPr>
-          <w:hyperlink w:anchor="_Toc243036271" w:history="1">
+          <w:hyperlink w:anchor="_Toc243347149" w:history="1">
             <w:r>
               <w:rPr>
                 <w:rStyle w:val="Hyperlink"/>
                 <w:noProof/>
               </w:rPr>
-              <w:t>Reproduction Steps</w:t>
+              <w:t>Conclusion</w:t>
             </w:r>
             <w:r>
               <w:rPr>
@@ -1254,7 +1358,79 @@
                 <w:noProof/>
                 <w:webHidden/>
               </w:rPr>
-              <w:instrText xml:space="preserve"> PAGEREF _Toc243036271 \h </w:instrText>
+              <w:instrText xml:space="preserve"> PAGEREF _Toc243347149 \h </w:instrText>
+            </w:r>
+            <w:r>
+              <w:rPr>
+                <w:noProof/>
+                <w:webHidden/>
+              </w:rPr>
+            </w:r>
+            <w:r>
+              <w:rPr>
+                <w:noProof/>
+                <w:webHidden/>
+              </w:rPr>
+              <w:fldChar w:fldCharType="separate"/>
+            </w:r>
+            <w:r>
+              <w:rPr>
+                <w:noProof/>
+                <w:webHidden/>
+              </w:rPr>
+              <w:t>7</w:t>
+            </w:r>
+            <w:r>
+              <w:rPr>
+                <w:noProof/>
+                <w:webHidden/>
+              </w:rPr>
+              <w:fldChar w:fldCharType="end"/>
+            </w:r>
+          </w:hyperlink>
+        </w:p>
+        <w:p>
+          <w:pPr>
+            <w:pStyle w:val="TOC1"/>
+            <w:tabs>
+              <w:tab w:val="right" w:pos="9350"/>
+            </w:tabs>
+            <w:rPr>
+              <w:rFonts w:asciiTheme="minorHAnsi" w:eastAsiaTheme="minorEastAsia" w:hAnsiTheme="minorHAnsi" w:cstheme="minorBidi"/>
+              <w:noProof/>
+              <w:kern w:val="2"/>
+              <w:lang w:val="en-US"/>
+              <w14:ligatures w14:val="standardContextual"/>
+            </w:rPr>
+          </w:pPr>
+          <w:hyperlink w:anchor="_Toc243347150" w:history="1">
+            <w:r>
+              <w:rPr>
+                <w:rStyle w:val="Hyperlink"/>
+                <w:noProof/>
+              </w:rPr>
+              <w:t>Appendix A — Individual Query Screenshots</w:t>
+            </w:r>
+            <w:r>
+              <w:rPr>
+                <w:noProof/>
+                <w:webHidden/>
+              </w:rPr>
+              <w:tab/>
+            </w:r>
+            <w:r>
+              <w:rPr>
+                <w:noProof/>
+                <w:webHidden/>
+              </w:rPr>
+              <w:fldChar w:fldCharType="begin"/>
+            </w:r>
+            <w:r>
+              <w:rPr>
+                <w:noProof/>
+                <w:webHidden/>
+              </w:rPr>
+              <w:instrText xml:space="preserve"> PAGEREF _Toc243347150 \h </w:instrText>
             </w:r>
             <w:r>
               <w:rPr>
@@ -1299,231 +1475,7 @@
               <w14:ligatures w14:val="standardContextual"/>
             </w:rPr>
           </w:pPr>
-          <w:hyperlink w:anchor="_Toc243036272" w:history="1">
-            <w:r>
-              <w:rPr>
-                <w:rStyle w:val="Hyperlink"/>
-                <w:noProof/>
-              </w:rPr>
-              <w:t>Conclusion</w:t>
-            </w:r>
-            <w:r>
-              <w:rPr>
-                <w:noProof/>
-                <w:webHidden/>
-              </w:rPr>
-              <w:tab/>
-            </w:r>
-            <w:r>
-              <w:rPr>
-                <w:noProof/>
-                <w:webHidden/>
-              </w:rPr>
-              <w:fldChar w:fldCharType="begin"/>
-            </w:r>
-            <w:r>
-              <w:rPr>
-                <w:noProof/>
-                <w:webHidden/>
-              </w:rPr>
-              <w:instrText xml:space="preserve"> PAGEREF _Toc243036272 \h </w:instrText>
-            </w:r>
-            <w:r>
-              <w:rPr>
-                <w:noProof/>
-                <w:webHidden/>
-              </w:rPr>
-            </w:r>
-            <w:r>
-              <w:rPr>
-                <w:noProof/>
-                <w:webHidden/>
-              </w:rPr>
-              <w:fldChar w:fldCharType="separate"/>
-            </w:r>
-            <w:r>
-              <w:rPr>
-                <w:noProof/>
-                <w:webHidden/>
-              </w:rPr>
-              <w:t>8</w:t>
-            </w:r>
-            <w:r>
-              <w:rPr>
-                <w:noProof/>
-                <w:webHidden/>
-              </w:rPr>
-              <w:fldChar w:fldCharType="end"/>
-            </w:r>
-          </w:hyperlink>
-        </w:p>
-        <w:p>
-          <w:pPr>
-            <w:pStyle w:val="TOC1"/>
-            <w:tabs>
-              <w:tab w:val="right" w:pos="9350"/>
-            </w:tabs>
-            <w:rPr>
-              <w:rFonts w:asciiTheme="minorHAnsi" w:eastAsiaTheme="minorEastAsia" w:hAnsiTheme="minorHAnsi" w:cstheme="minorBidi"/>
-              <w:noProof/>
-              <w:kern w:val="2"/>
-              <w:lang w:val="en-US"/>
-              <w14:ligatures w14:val="standardContextual"/>
-            </w:rPr>
-          </w:pPr>
-          <w:hyperlink w:anchor="_Toc243036273" w:history="1">
-            <w:r>
-              <w:rPr>
-                <w:rStyle w:val="Hyperlink"/>
-                <w:noProof/>
-              </w:rPr>
-              <w:t>Appendix A — Individual Query Screenshots</w:t>
-            </w:r>
-            <w:r>
-              <w:rPr>
-                <w:noProof/>
-                <w:webHidden/>
-              </w:rPr>
-              <w:tab/>
-            </w:r>
-            <w:r>
-              <w:rPr>
-                <w:noProof/>
-                <w:webHidden/>
-              </w:rPr>
-              <w:fldChar w:fldCharType="begin"/>
-            </w:r>
-            <w:r>
-              <w:rPr>
-                <w:noProof/>
-                <w:webHidden/>
-              </w:rPr>
-              <w:instrText xml:space="preserve"> PAGEREF _Toc243036273 \h </w:instrText>
-            </w:r>
-            <w:r>
-              <w:rPr>
-                <w:noProof/>
-                <w:webHidden/>
-              </w:rPr>
-            </w:r>
-            <w:r>
-              <w:rPr>
-                <w:noProof/>
-                <w:webHidden/>
-              </w:rPr>
-              <w:fldChar w:fldCharType="separate"/>
-            </w:r>
-            <w:r>
-              <w:rPr>
-                <w:noProof/>
-                <w:webHidden/>
-              </w:rPr>
-              <w:t>9</w:t>
-            </w:r>
-            <w:r>
-              <w:rPr>
-                <w:noProof/>
-                <w:webHidden/>
-              </w:rPr>
-              <w:fldChar w:fldCharType="end"/>
-            </w:r>
-          </w:hyperlink>
-        </w:p>
-        <w:p>
-          <w:pPr>
-            <w:pStyle w:val="TOC1"/>
-            <w:tabs>
-              <w:tab w:val="right" w:pos="9350"/>
-            </w:tabs>
-            <w:rPr>
-              <w:rFonts w:asciiTheme="minorHAnsi" w:eastAsiaTheme="minorEastAsia" w:hAnsiTheme="minorHAnsi" w:cstheme="minorBidi"/>
-              <w:noProof/>
-              <w:kern w:val="2"/>
-              <w:lang w:val="en-US"/>
-              <w14:ligatures w14:val="standardContextual"/>
-            </w:rPr>
-          </w:pPr>
-          <w:hyperlink w:anchor="_Toc243036274" w:history="1">
-            <w:r>
-              <w:rPr>
-                <w:rStyle w:val="Hyperlink"/>
-                <w:rFonts w:asciiTheme="majorHAnsi" w:eastAsiaTheme="majorEastAsia" w:hAnsiTheme="majorHAnsi" w:cstheme="majorBidi"/>
-                <w:noProof/>
-              </w:rPr>
-              <w:t>Appendix B</w:t>
-            </w:r>
-            <w:r>
-              <w:rPr>
-                <w:rStyle w:val="Hyperlink"/>
-                <w:noProof/>
-              </w:rPr>
-              <w:t xml:space="preserve"> - Handout Checklist</w:t>
-            </w:r>
-            <w:r>
-              <w:rPr>
-                <w:noProof/>
-                <w:webHidden/>
-              </w:rPr>
-              <w:tab/>
-            </w:r>
-            <w:r>
-              <w:rPr>
-                <w:noProof/>
-                <w:webHidden/>
-              </w:rPr>
-              <w:fldChar w:fldCharType="begin"/>
-            </w:r>
-            <w:r>
-              <w:rPr>
-                <w:noProof/>
-                <w:webHidden/>
-              </w:rPr>
-              <w:instrText xml:space="preserve"> PAGEREF _Toc243036274 \h </w:instrText>
-            </w:r>
-            <w:r>
-              <w:rPr>
-                <w:noProof/>
-                <w:webHidden/>
-              </w:rPr>
-            </w:r>
-            <w:r>
-              <w:rPr>
-                <w:noProof/>
-                <w:webHidden/>
-              </w:rPr>
-              <w:fldChar w:fldCharType="separate"/>
-            </w:r>
-            <w:r>
-              <w:rPr>
-                <w:noProof/>
-                <w:webHidden/>
-              </w:rPr>
-              <w:t>26</w:t>
-            </w:r>
-            <w:r>
-              <w:rPr>
-                <w:noProof/>
-                <w:webHidden/>
-              </w:rPr>
-              <w:fldChar w:fldCharType="end"/>
-            </w:r>
-          </w:hyperlink>
-        </w:p>
-        <w:p>
-          <w:pPr>
-            <w:pStyle w:val="TOC1"/>
-            <w:tabs>
-              <w:tab w:val="right" w:pos="9350"/>
-            </w:tabs>
-            <w:rPr>
-              <w:rFonts w:asciiTheme="minorHAnsi" w:eastAsiaTheme="minorEastAsia" w:hAnsiTheme="minorHAnsi" w:cstheme="minorBidi"/>
-              <w:noProof/>
-              <w:kern w:val="2"/>
-              <w:lang w:val="en-US"/>
-              <w14:ligatures w14:val="standardContextual"/>
-            </w:rPr>
-          </w:pPr>
-          <w:hyperlink w:anchor="_Toc243036275" w:history="1">
+          <w:hyperlink w:anchor="_Toc243347151" w:history="1">
             <w:r>
               <w:rPr>
                 <w:rStyle w:val="Hyperlink"/>
@@ -1550,7 +1502,7 @@
                 <w:noProof/>
                 <w:webHidden/>
               </w:rPr>
-              <w:instrText xml:space="preserve"> PAGEREF _Toc243036275 \h </w:instrText>
+              <w:instrText xml:space="preserve"> PAGEREF _Toc243347151 \h </w:instrText>
             </w:r>
             <w:r>
               <w:rPr>
@@ -1570,7 +1522,7 @@
                 <w:noProof/>
                 <w:webHidden/>
               </w:rPr>
-              <w:t>27</w:t>
+              <w:t>28</w:t>
             </w:r>
             <w:r>
               <w:rPr>
@@ -1595,7 +1547,7 @@
               <w14:ligatures w14:val="standardContextual"/>
             </w:rPr>
           </w:pPr>
-          <w:hyperlink w:anchor="_Toc243036276" w:history="1">
+          <w:hyperlink w:anchor="_Toc243347152" w:history="1">
             <w:r>
               <w:rPr>
                 <w:rStyle w:val="Hyperlink"/>
@@ -1622,7 +1574,7 @@
                 <w:noProof/>
                 <w:webHidden/>
               </w:rPr>
-              <w:instrText xml:space="preserve"> PAGEREF _Toc243036276 \h </w:instrText>
+              <w:instrText xml:space="preserve"> PAGEREF _Toc243347152 \h </w:instrText>
             </w:r>
             <w:r>
               <w:rPr>
@@ -1642,7 +1594,7 @@
                 <w:noProof/>
                 <w:webHidden/>
               </w:rPr>
-              <w:t>27</w:t>
+              <w:t>28</w:t>
             </w:r>
             <w:r>
               <w:rPr>
@@ -1694,7 +1646,7 @@
         <w:pStyle w:val="Heading1"/>
       </w:pPr>
       <w:bookmarkStart w:id="0" w:name="_Toc242913039"/>
-      <w:bookmarkStart w:id="1" w:name="_Toc243036264"/>
+      <w:bookmarkStart w:id="1" w:name="_Toc243347143"/>
       <w:r>
         <w:t>Introduction</w:t>
       </w:r>
@@ -1716,7 +1668,7 @@
         <w:pStyle w:val="Heading1"/>
       </w:pPr>
       <w:bookmarkStart w:id="2" w:name="_Toc242913040"/>
-      <w:bookmarkStart w:id="3" w:name="_Toc243036265"/>
+      <w:bookmarkStart w:id="3" w:name="_Toc243347144"/>
       <w:r>
         <w:t>System Overview</w:t>
       </w:r>
@@ -1734,7 +1686,6 @@
         </w:rPr>
       </w:pPr>
       <w:bookmarkStart w:id="4" w:name="_Toc242913041"/>
-      <w:bookmarkStart w:id="5" w:name="_Toc243036266"/>
       <w:r>
         <w:rPr>
           <w:rFonts w:ascii="Segoe UI" w:hAnsi="Segoe UI" w:cs="Segoe UI"/>
@@ -1765,6 +1716,7 @@
       <w:pPr>
         <w:pStyle w:val="Heading1"/>
       </w:pPr>
+      <w:bookmarkStart w:id="5" w:name="_Toc243347145"/>
       <w:r>
         <w:lastRenderedPageBreak/>
         <w:t>Entity-Relationship Diagram</w:t>
@@ -1797,18 +1749,31 @@
         <w:pStyle w:val="Caption"/>
         <w:keepNext/>
       </w:pPr>
-      <w:bookmarkStart w:id="6" w:name="_Toc243035817"/>
+      <w:bookmarkStart w:id="6" w:name="_Toc243347117"/>
       <w:r>
         <w:t xml:space="preserve">Figure </w:t>
       </w:r>
-      <w:fldSimple w:instr=" SEQ Figure \* ARABIC ">
-        <w:r>
-          <w:rPr>
-            <w:noProof/>
-          </w:rPr>
-          <w:t>1</w:t>
-        </w:r>
-      </w:fldSimple>
+      <w:r>
+        <w:fldChar w:fldCharType="begin"/>
+      </w:r>
+      <w:r>
+        <w:instrText xml:space="preserve"> SEQ Figure \* ARABIC </w:instrText>
+      </w:r>
+      <w:r>
+        <w:fldChar w:fldCharType="separate"/>
+      </w:r>
+      <w:r>
+        <w:rPr>
+          <w:noProof/>
+        </w:rPr>
+        <w:t>1</w:t>
+      </w:r>
+      <w:r>
+        <w:rPr>
+          <w:noProof/>
+        </w:rPr>
+        <w:fldChar w:fldCharType="end"/>
+      </w:r>
       <w:r>
         <w:t>: ER Diagram</w:t>
       </w:r>
@@ -1869,7 +1834,6 @@
     </w:p>
     <w:p>
       <w:bookmarkStart w:id="7" w:name="_Toc242913042"/>
-      <w:bookmarkStart w:id="8" w:name="_Toc243036267"/>
       <w:r>
         <w:t xml:space="preserve">Figure 1 shows our ER diagram. We modelled the patient journey as a chain: a patient has many admissions; each admission is linked to one triage_assessment, one or more diagnosis records (with exactly one marked as primary), optional icu_stay and surgical_procedure records, and one discharge_record. Staff are modelled separately: physician and nurse connect to admissions through the tables where they act (e.g., admitting_prof_id on admission, nurse_id on triage). Diagnostic work follows a strict path — diagnostic_order → radiology_examination → radiology_report — because one order can produce one exam, and each exam has one report. We made icu_stay a separate entity (rather than a column on admission) because a patient can move between units (ICU, CCU, MICU, SICU) during a single stay, and Q15/Q16 </w:t>
       </w:r>
@@ -1897,6 +1861,7 @@
       <w:pPr>
         <w:pStyle w:val="Heading1"/>
       </w:pPr>
+      <w:bookmarkStart w:id="8" w:name="_Toc243347146"/>
       <w:r>
         <w:lastRenderedPageBreak/>
         <w:t>Relational Schema</w:t>
@@ -1966,9 +1931,14 @@
         <w:spacing w:after="0" w:line="240" w:lineRule="auto"/>
         <w:rPr>
           <w:rFonts w:ascii="Arial" w:eastAsia="Arial" w:hAnsi="Arial" w:cs="Arial"/>
-          <w:lang w:val="en-US"/>
-        </w:rPr>
-      </w:pPr>
+        </w:rPr>
+      </w:pPr>
+      <w:r>
+        <w:rPr>
+          <w:rFonts w:ascii="Arial" w:eastAsia="Arial" w:hAnsi="Arial" w:cs="Arial"/>
+        </w:rPr>
+        <w:t>Below is the formal relational schema mapping for the 14 operational tables:</w:t>
+      </w:r>
     </w:p>
     <w:p>
       <w:pPr>
@@ -1977,22 +1947,15 @@
           <w:rFonts w:ascii="Arial" w:eastAsia="Arial" w:hAnsi="Arial" w:cs="Arial"/>
         </w:rPr>
       </w:pPr>
-      <w:r>
-        <w:rPr>
-          <w:rFonts w:ascii="Arial" w:eastAsia="Arial" w:hAnsi="Arial" w:cs="Arial"/>
-        </w:rPr>
-        <w:t>Below is the formal relational schema mapping for the 14 operational tables:</w:t>
-      </w:r>
-    </w:p>
-    <w:p>
-      <w:pPr>
-        <w:spacing w:after="0" w:line="240" w:lineRule="auto"/>
-        <w:rPr>
-          <w:rFonts w:ascii="Arial" w:eastAsia="Arial" w:hAnsi="Arial" w:cs="Arial"/>
-        </w:rPr>
-      </w:pPr>
-    </w:p>
-    <w:p>
+    </w:p>
+    <w:p>
+      <w:pPr>
+        <w:pStyle w:val="ListParagraph"/>
+        <w:numPr>
+          <w:ilvl w:val="0"/>
+          <w:numId w:val="8"/>
+        </w:numPr>
+      </w:pPr>
       <w:r>
         <w:t>icd9_dict (icd9_code</w:t>
       </w:r>
@@ -2001,6 +1964,13 @@
       </w:r>
     </w:p>
     <w:p>
+      <w:pPr>
+        <w:pStyle w:val="ListParagraph"/>
+        <w:numPr>
+          <w:ilvl w:val="0"/>
+          <w:numId w:val="8"/>
+        </w:numPr>
+      </w:pPr>
       <w:r>
         <w:t>physician (physician_id,</w:t>
       </w:r>
@@ -2009,6 +1979,13 @@
       </w:r>
     </w:p>
     <w:p>
+      <w:pPr>
+        <w:pStyle w:val="ListParagraph"/>
+        <w:numPr>
+          <w:ilvl w:val="0"/>
+          <w:numId w:val="8"/>
+        </w:numPr>
+      </w:pPr>
       <w:r>
         <w:t xml:space="preserve">nurse (nurse_id, </w:t>
       </w:r>
@@ -2017,6 +1994,13 @@
       </w:r>
     </w:p>
     <w:p>
+      <w:pPr>
+        <w:pStyle w:val="ListParagraph"/>
+        <w:numPr>
+          <w:ilvl w:val="0"/>
+          <w:numId w:val="8"/>
+        </w:numPr>
+      </w:pPr>
       <w:r>
         <w:t>patient (patient_id,</w:t>
       </w:r>
@@ -2025,6 +2009,13 @@
       </w:r>
     </w:p>
     <w:p>
+      <w:pPr>
+        <w:pStyle w:val="ListParagraph"/>
+        <w:numPr>
+          <w:ilvl w:val="0"/>
+          <w:numId w:val="8"/>
+        </w:numPr>
+      </w:pPr>
       <w:r>
         <w:t xml:space="preserve">admission (admission_id, </w:t>
       </w:r>
@@ -2039,6 +2030,13 @@
       </w:r>
     </w:p>
     <w:p>
+      <w:pPr>
+        <w:pStyle w:val="ListParagraph"/>
+        <w:numPr>
+          <w:ilvl w:val="1"/>
+          <w:numId w:val="8"/>
+        </w:numPr>
+      </w:pPr>
       <w:r>
         <w:t>Foreign Keys: patient_id references patient(patient_id), admitting_prof_id</w:t>
       </w:r>
@@ -2050,6 +2048,13 @@
       </w:r>
     </w:p>
     <w:p>
+      <w:pPr>
+        <w:pStyle w:val="ListParagraph"/>
+        <w:numPr>
+          <w:ilvl w:val="0"/>
+          <w:numId w:val="8"/>
+        </w:numPr>
+      </w:pPr>
       <w:r>
         <w:t>triage_assessment (triage_id</w:t>
       </w:r>
@@ -2078,6 +2083,13 @@
       </w:r>
     </w:p>
     <w:p>
+      <w:pPr>
+        <w:pStyle w:val="ListParagraph"/>
+        <w:numPr>
+          <w:ilvl w:val="1"/>
+          <w:numId w:val="8"/>
+        </w:numPr>
+      </w:pPr>
       <w:r>
         <w:t>Foreign Key</w:t>
       </w:r>
@@ -2093,6 +2105,13 @@
       </w:r>
     </w:p>
     <w:p>
+      <w:pPr>
+        <w:pStyle w:val="ListParagraph"/>
+        <w:numPr>
+          <w:ilvl w:val="0"/>
+          <w:numId w:val="8"/>
+        </w:numPr>
+      </w:pPr>
       <w:r>
         <w:t>diagnosis (diagnosis_id</w:t>
       </w:r>
@@ -2123,6 +2142,13 @@
       </w:r>
     </w:p>
     <w:p>
+      <w:pPr>
+        <w:pStyle w:val="ListParagraph"/>
+        <w:numPr>
+          <w:ilvl w:val="1"/>
+          <w:numId w:val="8"/>
+        </w:numPr>
+      </w:pPr>
       <w:r>
         <w:t>Foreign Keys</w:t>
       </w:r>
@@ -2138,8 +2164,14 @@
       </w:r>
     </w:p>
     <w:p>
-      <w:r>
-        <w:lastRenderedPageBreak/>
+      <w:pPr>
+        <w:pStyle w:val="ListParagraph"/>
+        <w:numPr>
+          <w:ilvl w:val="0"/>
+          <w:numId w:val="8"/>
+        </w:numPr>
+      </w:pPr>
+      <w:r>
         <w:t>icu_stay (unit_stay_number</w:t>
       </w:r>
       <w:r>
@@ -2159,6 +2191,13 @@
       </w:r>
     </w:p>
     <w:p>
+      <w:pPr>
+        <w:pStyle w:val="ListParagraph"/>
+        <w:numPr>
+          <w:ilvl w:val="1"/>
+          <w:numId w:val="8"/>
+        </w:numPr>
+      </w:pPr>
       <w:r>
         <w:t>Foreign Keys</w:t>
       </w:r>
@@ -2174,7 +2213,15 @@
       </w:r>
     </w:p>
     <w:p>
-      <w:r>
+      <w:pPr>
+        <w:pStyle w:val="ListParagraph"/>
+        <w:numPr>
+          <w:ilvl w:val="0"/>
+          <w:numId w:val="8"/>
+        </w:numPr>
+      </w:pPr>
+      <w:r>
+        <w:lastRenderedPageBreak/>
         <w:t>clinical_note (note_id, admission_id, author_prof_id, note_date_time, note_text,</w:t>
       </w:r>
       <w:r>
@@ -2182,6 +2229,13 @@
       </w:r>
     </w:p>
     <w:p>
+      <w:pPr>
+        <w:pStyle w:val="ListParagraph"/>
+        <w:numPr>
+          <w:ilvl w:val="1"/>
+          <w:numId w:val="8"/>
+        </w:numPr>
+      </w:pPr>
       <w:r>
         <w:rPr>
           <w:i/>
@@ -2194,6 +2248,13 @@
       </w:r>
     </w:p>
     <w:p>
+      <w:pPr>
+        <w:pStyle w:val="ListParagraph"/>
+        <w:numPr>
+          <w:ilvl w:val="0"/>
+          <w:numId w:val="8"/>
+        </w:numPr>
+      </w:pPr>
       <w:r>
         <w:t>diagnostic_order (order_id</w:t>
       </w:r>
@@ -2222,6 +2283,13 @@
       </w:r>
     </w:p>
     <w:p>
+      <w:pPr>
+        <w:pStyle w:val="ListParagraph"/>
+        <w:numPr>
+          <w:ilvl w:val="1"/>
+          <w:numId w:val="8"/>
+        </w:numPr>
+      </w:pPr>
       <w:r>
         <w:t>Foreign Keys</w:t>
       </w:r>
@@ -2237,6 +2305,13 @@
       </w:r>
     </w:p>
     <w:p>
+      <w:pPr>
+        <w:pStyle w:val="ListParagraph"/>
+        <w:numPr>
+          <w:ilvl w:val="0"/>
+          <w:numId w:val="8"/>
+        </w:numPr>
+      </w:pPr>
       <w:r>
         <w:t>radiology_examination (examination_id</w:t>
       </w:r>
@@ -2265,6 +2340,13 @@
       </w:r>
     </w:p>
     <w:p>
+      <w:pPr>
+        <w:pStyle w:val="ListParagraph"/>
+        <w:numPr>
+          <w:ilvl w:val="1"/>
+          <w:numId w:val="8"/>
+        </w:numPr>
+      </w:pPr>
       <w:r>
         <w:t>Foreign Keys</w:t>
       </w:r>
@@ -2280,6 +2362,13 @@
       </w:r>
     </w:p>
     <w:p>
+      <w:pPr>
+        <w:pStyle w:val="ListParagraph"/>
+        <w:numPr>
+          <w:ilvl w:val="0"/>
+          <w:numId w:val="8"/>
+        </w:numPr>
+      </w:pPr>
       <w:r>
         <w:t>surgical_procedure (procedure_id</w:t>
       </w:r>
@@ -2318,6 +2407,13 @@
       </w:r>
     </w:p>
     <w:p>
+      <w:pPr>
+        <w:pStyle w:val="ListParagraph"/>
+        <w:numPr>
+          <w:ilvl w:val="1"/>
+          <w:numId w:val="8"/>
+        </w:numPr>
+      </w:pPr>
       <w:r>
         <w:t>Foreign Keys</w:t>
       </w:r>
@@ -2367,6 +2463,13 @@
       </w:r>
     </w:p>
     <w:p>
+      <w:pPr>
+        <w:pStyle w:val="ListParagraph"/>
+        <w:numPr>
+          <w:ilvl w:val="0"/>
+          <w:numId w:val="8"/>
+        </w:numPr>
+      </w:pPr>
       <w:r>
         <w:t>discharge_record (discharge_id</w:t>
       </w:r>
@@ -2401,6 +2504,13 @@
       </w:r>
     </w:p>
     <w:p>
+      <w:pPr>
+        <w:pStyle w:val="ListParagraph"/>
+        <w:numPr>
+          <w:ilvl w:val="1"/>
+          <w:numId w:val="8"/>
+        </w:numPr>
+      </w:pPr>
       <w:r>
         <w:t>Foreign Keys</w:t>
       </w:r>
@@ -2462,7 +2572,6 @@
         </w:rPr>
       </w:pPr>
       <w:bookmarkStart w:id="9" w:name="_Toc242913043"/>
-      <w:bookmarkStart w:id="10" w:name="_Toc243036268"/>
       <w:r>
         <w:br w:type="page"/>
       </w:r>
@@ -2471,6 +2580,7 @@
       <w:pPr>
         <w:pStyle w:val="Heading1"/>
       </w:pPr>
+      <w:bookmarkStart w:id="10" w:name="_Toc243347147"/>
       <w:r>
         <w:lastRenderedPageBreak/>
         <w:t>Data Population</w:t>
@@ -2701,18 +2811,31 @@
         <w:pStyle w:val="Caption"/>
         <w:keepNext/>
       </w:pPr>
-      <w:bookmarkStart w:id="11" w:name="_Toc243035818"/>
+      <w:bookmarkStart w:id="11" w:name="_Toc243347118"/>
       <w:r>
         <w:t xml:space="preserve">Figure </w:t>
       </w:r>
-      <w:fldSimple w:instr=" SEQ Figure \* ARABIC ">
-        <w:r>
-          <w:rPr>
-            <w:noProof/>
-          </w:rPr>
-          <w:t>2</w:t>
-        </w:r>
-      </w:fldSimple>
+      <w:r>
+        <w:fldChar w:fldCharType="begin"/>
+      </w:r>
+      <w:r>
+        <w:instrText xml:space="preserve"> SEQ Figure \* ARABIC </w:instrText>
+      </w:r>
+      <w:r>
+        <w:fldChar w:fldCharType="separate"/>
+      </w:r>
+      <w:r>
+        <w:rPr>
+          <w:noProof/>
+        </w:rPr>
+        <w:t>2</w:t>
+      </w:r>
+      <w:r>
+        <w:rPr>
+          <w:noProof/>
+        </w:rPr>
+        <w:fldChar w:fldCharType="end"/>
+      </w:r>
       <w:r>
         <w:t>: Database Statistics</w:t>
       </w:r>
@@ -2821,7 +2944,7 @@
       <w:pPr>
         <w:pStyle w:val="Heading1"/>
       </w:pPr>
-      <w:bookmarkStart w:id="13" w:name="_Toc243036271"/>
+      <w:bookmarkStart w:id="13" w:name="_Toc243347148"/>
       <w:r>
         <w:lastRenderedPageBreak/>
         <w:t>Reproduction Steps</w:t>
@@ -2909,7 +3032,7 @@
         <w:pStyle w:val="Heading1"/>
       </w:pPr>
       <w:bookmarkStart w:id="14" w:name="_Toc242913047"/>
-      <w:bookmarkStart w:id="15" w:name="_Toc243036272"/>
+      <w:bookmarkStart w:id="15" w:name="_Toc243347149"/>
       <w:r>
         <w:t>Conclusion</w:t>
       </w:r>
@@ -2989,7 +3112,6 @@
       </w:pPr>
       <w:bookmarkStart w:id="16" w:name="_Toc242913048"/>
       <w:bookmarkStart w:id="17" w:name="_Ref243032483"/>
-      <w:bookmarkStart w:id="18" w:name="_Toc243036273"/>
       <w:r>
         <w:br w:type="page"/>
       </w:r>
@@ -2998,6 +3120,7 @@
       <w:pPr>
         <w:pStyle w:val="Heading1"/>
       </w:pPr>
+      <w:bookmarkStart w:id="18" w:name="_Toc243347150"/>
       <w:r>
         <w:lastRenderedPageBreak/>
         <w:t>Appendix A — Individual Query Screenshots</w:t>
@@ -3126,18 +3249,31 @@
         <w:pStyle w:val="Caption"/>
         <w:keepNext/>
       </w:pPr>
-      <w:bookmarkStart w:id="20" w:name="_Toc243035819"/>
+      <w:bookmarkStart w:id="20" w:name="_Toc243347119"/>
       <w:r>
         <w:t xml:space="preserve">Figure </w:t>
       </w:r>
-      <w:fldSimple w:instr=" SEQ Figure \* ARABIC ">
-        <w:r>
-          <w:rPr>
-            <w:noProof/>
-          </w:rPr>
-          <w:t>3</w:t>
-        </w:r>
-      </w:fldSimple>
+      <w:r>
+        <w:fldChar w:fldCharType="begin"/>
+      </w:r>
+      <w:r>
+        <w:instrText xml:space="preserve"> SEQ Figure \* ARABIC </w:instrText>
+      </w:r>
+      <w:r>
+        <w:fldChar w:fldCharType="separate"/>
+      </w:r>
+      <w:r>
+        <w:rPr>
+          <w:noProof/>
+        </w:rPr>
+        <w:t>3</w:t>
+      </w:r>
+      <w:r>
+        <w:rPr>
+          <w:noProof/>
+        </w:rPr>
+        <w:fldChar w:fldCharType="end"/>
+      </w:r>
       <w:r>
         <w:t>: Query 1</w:t>
       </w:r>
@@ -3217,18 +3353,31 @@
         <w:pStyle w:val="Caption"/>
         <w:keepNext/>
       </w:pPr>
-      <w:bookmarkStart w:id="21" w:name="_Toc243035820"/>
+      <w:bookmarkStart w:id="21" w:name="_Toc243347120"/>
       <w:r>
         <w:t xml:space="preserve">Figure </w:t>
       </w:r>
-      <w:fldSimple w:instr=" SEQ Figure \* ARABIC ">
-        <w:r>
-          <w:rPr>
-            <w:noProof/>
-          </w:rPr>
-          <w:t>4</w:t>
-        </w:r>
-      </w:fldSimple>
+      <w:r>
+        <w:fldChar w:fldCharType="begin"/>
+      </w:r>
+      <w:r>
+        <w:instrText xml:space="preserve"> SEQ Figure \* ARABIC </w:instrText>
+      </w:r>
+      <w:r>
+        <w:fldChar w:fldCharType="separate"/>
+      </w:r>
+      <w:r>
+        <w:rPr>
+          <w:noProof/>
+        </w:rPr>
+        <w:t>4</w:t>
+      </w:r>
+      <w:r>
+        <w:rPr>
+          <w:noProof/>
+        </w:rPr>
+        <w:fldChar w:fldCharType="end"/>
+      </w:r>
       <w:r>
         <w:t>: Output Query 1</w:t>
       </w:r>
@@ -3550,18 +3699,31 @@
         <w:pStyle w:val="Caption"/>
         <w:keepNext/>
       </w:pPr>
-      <w:bookmarkStart w:id="22" w:name="_Toc243035821"/>
+      <w:bookmarkStart w:id="22" w:name="_Toc243347121"/>
       <w:r>
         <w:t xml:space="preserve">Figure </w:t>
       </w:r>
-      <w:fldSimple w:instr=" SEQ Figure \* ARABIC ">
-        <w:r>
-          <w:rPr>
-            <w:noProof/>
-          </w:rPr>
-          <w:t>5</w:t>
-        </w:r>
-      </w:fldSimple>
+      <w:r>
+        <w:fldChar w:fldCharType="begin"/>
+      </w:r>
+      <w:r>
+        <w:instrText xml:space="preserve"> SEQ Figure \* ARABIC </w:instrText>
+      </w:r>
+      <w:r>
+        <w:fldChar w:fldCharType="separate"/>
+      </w:r>
+      <w:r>
+        <w:rPr>
+          <w:noProof/>
+        </w:rPr>
+        <w:t>5</w:t>
+      </w:r>
+      <w:r>
+        <w:rPr>
+          <w:noProof/>
+        </w:rPr>
+        <w:fldChar w:fldCharType="end"/>
+      </w:r>
       <w:r>
         <w:t>: Query 2</w:t>
       </w:r>
@@ -3674,18 +3836,31 @@
         <w:pStyle w:val="Caption"/>
         <w:keepNext/>
       </w:pPr>
-      <w:bookmarkStart w:id="23" w:name="_Toc243035822"/>
+      <w:bookmarkStart w:id="23" w:name="_Toc243347122"/>
       <w:r>
         <w:t xml:space="preserve">Figure </w:t>
       </w:r>
-      <w:fldSimple w:instr=" SEQ Figure \* ARABIC ">
-        <w:r>
-          <w:rPr>
-            <w:noProof/>
-          </w:rPr>
-          <w:t>6</w:t>
-        </w:r>
-      </w:fldSimple>
+      <w:r>
+        <w:fldChar w:fldCharType="begin"/>
+      </w:r>
+      <w:r>
+        <w:instrText xml:space="preserve"> SEQ Figure \* ARABIC </w:instrText>
+      </w:r>
+      <w:r>
+        <w:fldChar w:fldCharType="separate"/>
+      </w:r>
+      <w:r>
+        <w:rPr>
+          <w:noProof/>
+        </w:rPr>
+        <w:t>6</w:t>
+      </w:r>
+      <w:r>
+        <w:rPr>
+          <w:noProof/>
+        </w:rPr>
+        <w:fldChar w:fldCharType="end"/>
+      </w:r>
       <w:r>
         <w:t>: Output Query 2</w:t>
       </w:r>
@@ -4031,18 +4206,31 @@
         <w:pStyle w:val="Caption"/>
         <w:keepNext/>
       </w:pPr>
-      <w:bookmarkStart w:id="24" w:name="_Toc243035823"/>
+      <w:bookmarkStart w:id="24" w:name="_Toc243347123"/>
       <w:r>
         <w:t xml:space="preserve">Figure </w:t>
       </w:r>
-      <w:fldSimple w:instr=" SEQ Figure \* ARABIC ">
-        <w:r>
-          <w:rPr>
-            <w:noProof/>
-          </w:rPr>
-          <w:t>7</w:t>
-        </w:r>
-      </w:fldSimple>
+      <w:r>
+        <w:fldChar w:fldCharType="begin"/>
+      </w:r>
+      <w:r>
+        <w:instrText xml:space="preserve"> SEQ Figure \* ARABIC </w:instrText>
+      </w:r>
+      <w:r>
+        <w:fldChar w:fldCharType="separate"/>
+      </w:r>
+      <w:r>
+        <w:rPr>
+          <w:noProof/>
+        </w:rPr>
+        <w:t>7</w:t>
+      </w:r>
+      <w:r>
+        <w:rPr>
+          <w:noProof/>
+        </w:rPr>
+        <w:fldChar w:fldCharType="end"/>
+      </w:r>
       <w:r>
         <w:t>: Query 3</w:t>
       </w:r>
@@ -4133,18 +4321,31 @@
         <w:pStyle w:val="Caption"/>
         <w:keepNext/>
       </w:pPr>
-      <w:bookmarkStart w:id="25" w:name="_Toc243035824"/>
+      <w:bookmarkStart w:id="25" w:name="_Toc243347124"/>
       <w:r>
         <w:t xml:space="preserve">Figure </w:t>
       </w:r>
-      <w:fldSimple w:instr=" SEQ Figure \* ARABIC ">
-        <w:r>
-          <w:rPr>
-            <w:noProof/>
-          </w:rPr>
-          <w:t>8</w:t>
-        </w:r>
-      </w:fldSimple>
+      <w:r>
+        <w:fldChar w:fldCharType="begin"/>
+      </w:r>
+      <w:r>
+        <w:instrText xml:space="preserve"> SEQ Figure \* ARABIC </w:instrText>
+      </w:r>
+      <w:r>
+        <w:fldChar w:fldCharType="separate"/>
+      </w:r>
+      <w:r>
+        <w:rPr>
+          <w:noProof/>
+        </w:rPr>
+        <w:t>8</w:t>
+      </w:r>
+      <w:r>
+        <w:rPr>
+          <w:noProof/>
+        </w:rPr>
+        <w:fldChar w:fldCharType="end"/>
+      </w:r>
       <w:r>
         <w:t>: Output Query 3</w:t>
       </w:r>
@@ -4376,18 +4577,31 @@
         <w:pStyle w:val="Caption"/>
         <w:keepNext/>
       </w:pPr>
-      <w:bookmarkStart w:id="26" w:name="_Toc243035825"/>
+      <w:bookmarkStart w:id="26" w:name="_Toc243347125"/>
       <w:r>
         <w:t xml:space="preserve">Figure </w:t>
       </w:r>
-      <w:fldSimple w:instr=" SEQ Figure \* ARABIC ">
-        <w:r>
-          <w:rPr>
-            <w:noProof/>
-          </w:rPr>
-          <w:t>9</w:t>
-        </w:r>
-      </w:fldSimple>
+      <w:r>
+        <w:fldChar w:fldCharType="begin"/>
+      </w:r>
+      <w:r>
+        <w:instrText xml:space="preserve"> SEQ Figure \* ARABIC </w:instrText>
+      </w:r>
+      <w:r>
+        <w:fldChar w:fldCharType="separate"/>
+      </w:r>
+      <w:r>
+        <w:rPr>
+          <w:noProof/>
+        </w:rPr>
+        <w:t>9</w:t>
+      </w:r>
+      <w:r>
+        <w:rPr>
+          <w:noProof/>
+        </w:rPr>
+        <w:fldChar w:fldCharType="end"/>
+      </w:r>
       <w:r>
         <w:t>: Query 4</w:t>
       </w:r>
@@ -4488,18 +4702,31 @@
         <w:pStyle w:val="Caption"/>
         <w:keepNext/>
       </w:pPr>
-      <w:bookmarkStart w:id="27" w:name="_Toc243035826"/>
+      <w:bookmarkStart w:id="27" w:name="_Toc243347126"/>
       <w:r>
         <w:t xml:space="preserve">Figure </w:t>
       </w:r>
-      <w:fldSimple w:instr=" SEQ Figure \* ARABIC ">
-        <w:r>
-          <w:rPr>
-            <w:noProof/>
-          </w:rPr>
-          <w:t>10</w:t>
-        </w:r>
-      </w:fldSimple>
+      <w:r>
+        <w:fldChar w:fldCharType="begin"/>
+      </w:r>
+      <w:r>
+        <w:instrText xml:space="preserve"> SEQ Figure \* ARABIC </w:instrText>
+      </w:r>
+      <w:r>
+        <w:fldChar w:fldCharType="separate"/>
+      </w:r>
+      <w:r>
+        <w:rPr>
+          <w:noProof/>
+        </w:rPr>
+        <w:t>10</w:t>
+      </w:r>
+      <w:r>
+        <w:rPr>
+          <w:noProof/>
+        </w:rPr>
+        <w:fldChar w:fldCharType="end"/>
+      </w:r>
       <w:r>
         <w:t>: Output Query 4</w:t>
       </w:r>
@@ -4666,7 +4893,6 @@
         </w:rPr>
         <w:t xml:space="preserve"> the patient id. After that, for the diagnostic order, </w:t>
       </w:r>
-      <w:proofErr w:type="spellStart"/>
       <w:proofErr w:type="gramStart"/>
       <w:r>
         <w:rPr>
@@ -4675,7 +4901,6 @@
         </w:rPr>
         <w:t>its</w:t>
       </w:r>
-      <w:proofErr w:type="spellEnd"/>
       <w:proofErr w:type="gramEnd"/>
       <w:r>
         <w:rPr>
@@ -4713,10 +4938,7 @@
     </w:p>
     <w:p>
       <w:r>
-        <w:t xml:space="preserve"> Find all ICU or CCU unit stays that lasted more than seven days. Display the</w:t>
-      </w:r>
-      <w:r>
-        <w:t xml:space="preserve"> </w:t>
+        <w:t xml:space="preserve"> Find all ICU or CCU unit stays that lasted more than seven days. Display the </w:t>
       </w:r>
       <w:proofErr w:type="gramStart"/>
       <w:r>
@@ -4744,20 +4966,53 @@
     </w:p>
     <w:p>
       <w:pPr>
-        <w:rPr>
-          <w:b/>
-          <w:bCs/>
-        </w:rPr>
-      </w:pPr>
-      <w:r>
-        <w:rPr>
-          <w:b/>
-          <w:bCs/>
+        <w:pStyle w:val="Caption"/>
+        <w:keepNext/>
+      </w:pPr>
+      <w:bookmarkStart w:id="28" w:name="_Toc243347127"/>
+      <w:r>
+        <w:t xml:space="preserve">Figure </w:t>
+      </w:r>
+      <w:r>
+        <w:fldChar w:fldCharType="begin"/>
+      </w:r>
+      <w:r>
+        <w:instrText xml:space="preserve"> SEQ Figure \* ARABIC </w:instrText>
+      </w:r>
+      <w:r>
+        <w:fldChar w:fldCharType="separate"/>
+      </w:r>
+      <w:r>
+        <w:rPr>
+          <w:noProof/>
+        </w:rPr>
+        <w:t>11</w:t>
+      </w:r>
+      <w:r>
+        <w:fldChar w:fldCharType="end"/>
+      </w:r>
+      <w:r>
+        <w:t>: Query 5</w:t>
+      </w:r>
+      <w:bookmarkEnd w:id="28"/>
+    </w:p>
+    <w:p>
+      <w:pPr>
+        <w:rPr>
+          <w:b/>
+          <w:bCs/>
+        </w:rPr>
+      </w:pPr>
+      <w:r>
+        <w:rPr>
+          <w:b/>
+          <w:bCs/>
+          <w:noProof/>
         </w:rPr>
         <w:drawing>
-          <wp:inline distT="0" distB="0" distL="0" distR="0" wp14:anchorId="0BA27F2F" wp14:editId="3311BB30">
-            <wp:extent cx="5666667" cy="2323809"/>
-            <wp:effectExtent l="19050" t="19050" r="10795" b="19685"/>
+          <wp:inline distT="0" distB="0" distL="0" distR="0" wp14:anchorId="0BA27F2F" wp14:editId="3CF98C7A">
+            <wp:extent cx="5665828" cy="1714500"/>
+            <wp:effectExtent l="19050" t="19050" r="11430" b="19050"/>
             <wp:docPr id="2103566388" name="Picture 1"/>
             <wp:cNvGraphicFramePr>
               <a:graphicFrameLocks xmlns:a="http://schemas.openxmlformats.org/drawingml/2006/main" noChangeAspect="1"/>
@@ -4778,7 +5033,7 @@
                   <pic:spPr>
                     <a:xfrm>
                       <a:off x="0" y="0"/>
-                      <a:ext cx="5666667" cy="2323809"/>
+                      <a:ext cx="5670247" cy="1715837"/>
                     </a:xfrm>
                     <a:prstGeom prst="rect">
                       <a:avLst/>
@@ -4812,7 +5067,42 @@
       </w:r>
     </w:p>
     <w:p>
-      <w:r>
+      <w:pPr>
+        <w:pStyle w:val="Caption"/>
+        <w:keepNext/>
+      </w:pPr>
+      <w:bookmarkStart w:id="29" w:name="_Toc243347128"/>
+      <w:r>
+        <w:t xml:space="preserve">Figure </w:t>
+      </w:r>
+      <w:r>
+        <w:fldChar w:fldCharType="begin"/>
+      </w:r>
+      <w:r>
+        <w:instrText xml:space="preserve"> SEQ Figure \* ARABIC </w:instrText>
+      </w:r>
+      <w:r>
+        <w:fldChar w:fldCharType="separate"/>
+      </w:r>
+      <w:r>
+        <w:rPr>
+          <w:noProof/>
+        </w:rPr>
+        <w:t>12</w:t>
+      </w:r>
+      <w:r>
+        <w:fldChar w:fldCharType="end"/>
+      </w:r>
+      <w:r>
+        <w:t>: Output Query 5</w:t>
+      </w:r>
+      <w:bookmarkEnd w:id="29"/>
+    </w:p>
+    <w:p>
+      <w:r>
+        <w:rPr>
+          <w:noProof/>
+        </w:rPr>
         <w:drawing>
           <wp:inline distT="0" distB="0" distL="0" distR="0" wp14:anchorId="1DA1D286" wp14:editId="56D2ACCA">
             <wp:extent cx="3934460" cy="3422650"/>
@@ -4973,7 +5263,42 @@
       </w:r>
     </w:p>
     <w:p>
-      <w:r>
+      <w:pPr>
+        <w:pStyle w:val="Caption"/>
+        <w:keepNext/>
+      </w:pPr>
+      <w:bookmarkStart w:id="30" w:name="_Toc243347129"/>
+      <w:r>
+        <w:t xml:space="preserve">Figure </w:t>
+      </w:r>
+      <w:r>
+        <w:fldChar w:fldCharType="begin"/>
+      </w:r>
+      <w:r>
+        <w:instrText xml:space="preserve"> SEQ Figure \* ARABIC </w:instrText>
+      </w:r>
+      <w:r>
+        <w:fldChar w:fldCharType="separate"/>
+      </w:r>
+      <w:r>
+        <w:rPr>
+          <w:noProof/>
+        </w:rPr>
+        <w:t>13</w:t>
+      </w:r>
+      <w:r>
+        <w:fldChar w:fldCharType="end"/>
+      </w:r>
+      <w:r>
+        <w:t>: Query 6</w:t>
+      </w:r>
+      <w:bookmarkEnd w:id="30"/>
+    </w:p>
+    <w:p>
+      <w:r>
+        <w:rPr>
+          <w:noProof/>
+        </w:rPr>
         <w:drawing>
           <wp:inline distT="0" distB="0" distL="0" distR="0" wp14:anchorId="0F62A80E" wp14:editId="0F9FC30E">
             <wp:extent cx="4752381" cy="1495238"/>
@@ -5032,7 +5357,42 @@
       </w:r>
     </w:p>
     <w:p>
-      <w:r>
+      <w:pPr>
+        <w:pStyle w:val="Caption"/>
+        <w:keepNext/>
+      </w:pPr>
+      <w:bookmarkStart w:id="31" w:name="_Toc243347130"/>
+      <w:r>
+        <w:t xml:space="preserve">Figure </w:t>
+      </w:r>
+      <w:r>
+        <w:fldChar w:fldCharType="begin"/>
+      </w:r>
+      <w:r>
+        <w:instrText xml:space="preserve"> SEQ Figure \* ARABIC </w:instrText>
+      </w:r>
+      <w:r>
+        <w:fldChar w:fldCharType="separate"/>
+      </w:r>
+      <w:r>
+        <w:rPr>
+          <w:noProof/>
+        </w:rPr>
+        <w:t>14</w:t>
+      </w:r>
+      <w:r>
+        <w:fldChar w:fldCharType="end"/>
+      </w:r>
+      <w:r>
+        <w:t>: Output Query 6</w:t>
+      </w:r>
+      <w:bookmarkEnd w:id="31"/>
+    </w:p>
+    <w:p>
+      <w:r>
+        <w:rPr>
+          <w:noProof/>
+        </w:rPr>
         <w:drawing>
           <wp:inline distT="0" distB="0" distL="0" distR="0" wp14:anchorId="4AE86656" wp14:editId="1E8E2476">
             <wp:extent cx="3907790" cy="2851150"/>
@@ -5205,6 +5565,38 @@
     </w:p>
     <w:p>
       <w:pPr>
+        <w:pStyle w:val="Caption"/>
+        <w:keepNext/>
+      </w:pPr>
+      <w:bookmarkStart w:id="32" w:name="_Toc243347131"/>
+      <w:r>
+        <w:t xml:space="preserve">Figure </w:t>
+      </w:r>
+      <w:r>
+        <w:fldChar w:fldCharType="begin"/>
+      </w:r>
+      <w:r>
+        <w:instrText xml:space="preserve"> SEQ Figure \* ARABIC </w:instrText>
+      </w:r>
+      <w:r>
+        <w:fldChar w:fldCharType="separate"/>
+      </w:r>
+      <w:r>
+        <w:rPr>
+          <w:noProof/>
+        </w:rPr>
+        <w:t>15</w:t>
+      </w:r>
+      <w:r>
+        <w:fldChar w:fldCharType="end"/>
+      </w:r>
+      <w:r>
+        <w:t>: Query 7</w:t>
+      </w:r>
+      <w:bookmarkEnd w:id="32"/>
+    </w:p>
+    <w:p>
+      <w:pPr>
         <w:rPr>
           <w:b/>
           <w:bCs/>
@@ -5215,6 +5607,7 @@
         <w:rPr>
           <w:b/>
           <w:bCs/>
+          <w:noProof/>
           <w:lang w:val="en-US"/>
         </w:rPr>
         <w:drawing>
@@ -5278,6 +5671,38 @@
     </w:p>
     <w:p>
       <w:pPr>
+        <w:pStyle w:val="Caption"/>
+        <w:keepNext/>
+      </w:pPr>
+      <w:bookmarkStart w:id="33" w:name="_Toc243347132"/>
+      <w:r>
+        <w:t xml:space="preserve">Figure </w:t>
+      </w:r>
+      <w:r>
+        <w:fldChar w:fldCharType="begin"/>
+      </w:r>
+      <w:r>
+        <w:instrText xml:space="preserve"> SEQ Figure \* ARABIC </w:instrText>
+      </w:r>
+      <w:r>
+        <w:fldChar w:fldCharType="separate"/>
+      </w:r>
+      <w:r>
+        <w:rPr>
+          <w:noProof/>
+        </w:rPr>
+        <w:t>16</w:t>
+      </w:r>
+      <w:r>
+        <w:fldChar w:fldCharType="end"/>
+      </w:r>
+      <w:r>
+        <w:t>: Output Query 7</w:t>
+      </w:r>
+      <w:bookmarkEnd w:id="33"/>
+    </w:p>
+    <w:p>
+      <w:pPr>
         <w:rPr>
           <w:b/>
           <w:bCs/>
@@ -5288,6 +5713,7 @@
         <w:rPr>
           <w:b/>
           <w:bCs/>
+          <w:noProof/>
           <w:lang w:val="en-US"/>
         </w:rPr>
         <w:drawing>
@@ -5337,29 +5763,33 @@
         <w:rPr>
           <w:b/>
           <w:bCs/>
-          <w:lang w:val="en-US"/>
-        </w:rPr>
-      </w:pPr>
-      <w:r>
-        <w:rPr>
-          <w:b/>
-          <w:bCs/>
-          <w:lang w:val="en-US"/>
+          <w:lang w:val="fr-FR"/>
+        </w:rPr>
+      </w:pPr>
+      <w:proofErr w:type="gramStart"/>
+      <w:r>
+        <w:rPr>
+          <w:b/>
+          <w:bCs/>
+          <w:lang w:val="fr-FR"/>
         </w:rPr>
         <w:t>Logic:</w:t>
       </w:r>
-    </w:p>
-    <w:p>
-      <w:pPr>
-        <w:rPr>
-          <w:b/>
-          <w:bCs/>
-        </w:rPr>
-      </w:pPr>
-      <w:r>
-        <w:rPr>
-          <w:b/>
-          <w:bCs/>
+      <w:proofErr w:type="gramEnd"/>
+    </w:p>
+    <w:p>
+      <w:pPr>
+        <w:rPr>
+          <w:b/>
+          <w:bCs/>
+          <w:lang w:val="fr-FR"/>
+        </w:rPr>
+      </w:pPr>
+      <w:r>
+        <w:rPr>
+          <w:b/>
+          <w:bCs/>
+          <w:lang w:val="fr-FR"/>
         </w:rPr>
         <w:br w:type="page"/>
       </w:r>
@@ -5369,39 +5799,91 @@
         <w:rPr>
           <w:i/>
           <w:iCs/>
-        </w:rPr>
-      </w:pPr>
-      <w:r>
-        <w:rPr>
-          <w:b/>
-          <w:bCs/>
+          <w:lang w:val="fr-FR"/>
+        </w:rPr>
+      </w:pPr>
+      <w:r>
+        <w:rPr>
+          <w:b/>
+          <w:bCs/>
+          <w:lang w:val="fr-FR"/>
         </w:rPr>
         <w:lastRenderedPageBreak/>
-        <w:t xml:space="preserve">Q8: </w:t>
-      </w:r>
-      <w:r>
+        <w:t>Q</w:t>
+      </w:r>
+      <w:proofErr w:type="gramStart"/>
+      <w:r>
+        <w:rPr>
+          <w:b/>
+          <w:bCs/>
+          <w:lang w:val="fr-FR"/>
+        </w:rPr>
+        <w:t>8:</w:t>
+      </w:r>
+      <w:proofErr w:type="gramEnd"/>
+      <w:r>
+        <w:rPr>
+          <w:b/>
+          <w:bCs/>
+          <w:lang w:val="fr-FR"/>
+        </w:rPr>
+        <w:t xml:space="preserve"> </w:t>
+      </w:r>
+      <w:r>
+        <w:rPr>
+          <w:lang w:val="fr-FR"/>
+        </w:rPr>
         <w:t>[JuanMa</w:t>
       </w:r>
       <w:r>
         <w:rPr>
           <w:i/>
           <w:iCs/>
+          <w:lang w:val="fr-FR"/>
         </w:rPr>
         <w:t>]</w:t>
       </w:r>
     </w:p>
-    <w:p/>
-    <w:p/>
-    <w:p/>
-    <w:p/>
-    <w:p>
-      <w:pPr>
-        <w:rPr>
-          <w:b/>
-          <w:bCs/>
-        </w:rPr>
-      </w:pPr>
-      <w:r>
+    <w:p>
+      <w:pPr>
+        <w:rPr>
+          <w:lang w:val="fr-FR"/>
+        </w:rPr>
+      </w:pPr>
+    </w:p>
+    <w:p>
+      <w:pPr>
+        <w:rPr>
+          <w:lang w:val="fr-FR"/>
+        </w:rPr>
+      </w:pPr>
+    </w:p>
+    <w:p>
+      <w:pPr>
+        <w:rPr>
+          <w:lang w:val="fr-FR"/>
+        </w:rPr>
+      </w:pPr>
+    </w:p>
+    <w:p>
+      <w:pPr>
+        <w:rPr>
+          <w:lang w:val="fr-FR"/>
+        </w:rPr>
+      </w:pPr>
+    </w:p>
+    <w:p>
+      <w:pPr>
+        <w:rPr>
+          <w:b/>
+          <w:bCs/>
+          <w:lang w:val="fr-FR"/>
+        </w:rPr>
+      </w:pPr>
+      <w:r>
+        <w:rPr>
+          <w:lang w:val="fr-FR"/>
+        </w:rPr>
         <w:br w:type="page"/>
       </w:r>
     </w:p>
@@ -5410,23 +5892,47 @@
         <w:rPr>
           <w:i/>
           <w:iCs/>
-        </w:rPr>
-      </w:pPr>
-      <w:r>
-        <w:rPr>
-          <w:b/>
-          <w:bCs/>
+          <w:lang w:val="fr-FR"/>
+        </w:rPr>
+      </w:pPr>
+      <w:r>
+        <w:rPr>
+          <w:b/>
+          <w:bCs/>
+          <w:lang w:val="fr-FR"/>
         </w:rPr>
         <w:lastRenderedPageBreak/>
-        <w:t xml:space="preserve">Q9: </w:t>
-      </w:r>
-      <w:r>
+        <w:t>Q</w:t>
+      </w:r>
+      <w:proofErr w:type="gramStart"/>
+      <w:r>
+        <w:rPr>
+          <w:b/>
+          <w:bCs/>
+          <w:lang w:val="fr-FR"/>
+        </w:rPr>
+        <w:t>9:</w:t>
+      </w:r>
+      <w:proofErr w:type="gramEnd"/>
+      <w:r>
+        <w:rPr>
+          <w:b/>
+          <w:bCs/>
+          <w:lang w:val="fr-FR"/>
+        </w:rPr>
+        <w:t xml:space="preserve"> </w:t>
+      </w:r>
+      <w:r>
+        <w:rPr>
+          <w:lang w:val="fr-FR"/>
+        </w:rPr>
         <w:t>[</w:t>
       </w:r>
       <w:r>
         <w:rPr>
           <w:i/>
           <w:iCs/>
+          <w:lang w:val="fr-FR"/>
         </w:rPr>
         <w:t>Mohammad]</w:t>
       </w:r>
@@ -8620,15 +9126,15 @@
       <w:pPr>
         <w:pStyle w:val="Heading1"/>
       </w:pPr>
-      <w:bookmarkStart w:id="28" w:name="_Toc242913049"/>
-      <w:bookmarkStart w:id="29" w:name="_Toc243036275"/>
+      <w:bookmarkStart w:id="34" w:name="_Toc242913049"/>
+      <w:bookmarkStart w:id="35" w:name="_Toc243347151"/>
       <w:r>
         <w:lastRenderedPageBreak/>
         <w:t>Table of Figures</w:t>
       </w:r>
-      <w:bookmarkStart w:id="30" w:name="_Toc242913050"/>
-      <w:bookmarkEnd w:id="28"/>
-      <w:bookmarkEnd w:id="29"/>
+      <w:bookmarkStart w:id="36" w:name="_Toc242913050"/>
+      <w:bookmarkEnd w:id="34"/>
+      <w:bookmarkEnd w:id="35"/>
     </w:p>
     <w:p>
       <w:pPr>
@@ -8657,7 +9163,7 @@
       <w:r>
         <w:fldChar w:fldCharType="separate"/>
       </w:r>
-      <w:hyperlink w:anchor="_Toc243035817" w:history="1">
+      <w:hyperlink w:anchor="_Toc243347117" w:history="1">
         <w:r>
           <w:rPr>
             <w:rStyle w:val="Hyperlink"/>
@@ -8684,7 +9190,7 @@
             <w:noProof/>
             <w:webHidden/>
           </w:rPr>
-          <w:instrText xml:space="preserve"> PAGEREF _Toc243035817 \h </w:instrText>
+          <w:instrText xml:space="preserve"> PAGEREF _Toc243347117 \h </w:instrText>
         </w:r>
         <w:r>
           <w:rPr>
@@ -8733,7 +9239,7 @@
           <w14:ligatures w14:val="standardContextual"/>
         </w:rPr>
       </w:pPr>
-      <w:hyperlink w:anchor="_Toc243035818" w:history="1">
+      <w:hyperlink w:anchor="_Toc243347118" w:history="1">
         <w:r>
           <w:rPr>
             <w:rStyle w:val="Hyperlink"/>
@@ -8760,7 +9266,7 @@
             <w:noProof/>
             <w:webHidden/>
           </w:rPr>
-          <w:instrText xml:space="preserve"> PAGEREF _Toc243035818 \h </w:instrText>
+          <w:instrText xml:space="preserve"> PAGEREF _Toc243347118 \h </w:instrText>
         </w:r>
         <w:r>
           <w:rPr>
@@ -8809,7 +9315,7 @@
           <w14:ligatures w14:val="standardContextual"/>
         </w:rPr>
       </w:pPr>
-      <w:hyperlink w:anchor="_Toc243035819" w:history="1">
+      <w:hyperlink w:anchor="_Toc243347119" w:history="1">
         <w:r>
           <w:rPr>
             <w:rStyle w:val="Hyperlink"/>
@@ -8836,7 +9342,159 @@
             <w:noProof/>
             <w:webHidden/>
           </w:rPr>
-          <w:instrText xml:space="preserve"> PAGEREF _Toc243035819 \h </w:instrText>
+          <w:instrText xml:space="preserve"> PAGEREF _Toc243347119 \h </w:instrText>
+        </w:r>
+        <w:r>
+          <w:rPr>
+            <w:noProof/>
+            <w:webHidden/>
+          </w:rPr>
+        </w:r>
+        <w:r>
+          <w:rPr>
+            <w:noProof/>
+            <w:webHidden/>
+          </w:rPr>
+          <w:fldChar w:fldCharType="separate"/>
+        </w:r>
+        <w:r>
+          <w:rPr>
+            <w:noProof/>
+            <w:webHidden/>
+          </w:rPr>
+          <w:t>8</w:t>
+        </w:r>
+        <w:r>
+          <w:rPr>
+            <w:noProof/>
+            <w:webHidden/>
+          </w:rPr>
+          <w:fldChar w:fldCharType="end"/>
+        </w:r>
+      </w:hyperlink>
+    </w:p>
+    <w:p>
+      <w:pPr>
+        <w:pStyle w:val="TableofFigures"/>
+        <w:tabs>
+          <w:tab w:val="right" w:leader="dot" w:pos="9350"/>
+        </w:tabs>
+        <w:rPr>
+          <w:rFonts w:eastAsiaTheme="minorEastAsia" w:cstheme="minorBidi"/>
+          <w:i w:val="0"/>
+          <w:iCs w:val="0"/>
+          <w:noProof/>
+          <w:kern w:val="2"/>
+          <w:sz w:val="24"/>
+          <w:szCs w:val="24"/>
+          <w:lang w:val="en-US"/>
+          <w14:ligatures w14:val="standardContextual"/>
+        </w:rPr>
+      </w:pPr>
+      <w:hyperlink w:anchor="_Toc243347120" w:history="1">
+        <w:r>
+          <w:rPr>
+            <w:rStyle w:val="Hyperlink"/>
+            <w:noProof/>
+          </w:rPr>
+          <w:t>Figure 4: Output Query 1</w:t>
+        </w:r>
+        <w:r>
+          <w:rPr>
+            <w:noProof/>
+            <w:webHidden/>
+          </w:rPr>
+          <w:tab/>
+        </w:r>
+        <w:r>
+          <w:rPr>
+            <w:noProof/>
+            <w:webHidden/>
+          </w:rPr>
+          <w:fldChar w:fldCharType="begin"/>
+        </w:r>
+        <w:r>
+          <w:rPr>
+            <w:noProof/>
+            <w:webHidden/>
+          </w:rPr>
+          <w:instrText xml:space="preserve"> PAGEREF _Toc243347120 \h </w:instrText>
+        </w:r>
+        <w:r>
+          <w:rPr>
+            <w:noProof/>
+            <w:webHidden/>
+          </w:rPr>
+        </w:r>
+        <w:r>
+          <w:rPr>
+            <w:noProof/>
+            <w:webHidden/>
+          </w:rPr>
+          <w:fldChar w:fldCharType="separate"/>
+        </w:r>
+        <w:r>
+          <w:rPr>
+            <w:noProof/>
+            <w:webHidden/>
+          </w:rPr>
+          <w:t>8</w:t>
+        </w:r>
+        <w:r>
+          <w:rPr>
+            <w:noProof/>
+            <w:webHidden/>
+          </w:rPr>
+          <w:fldChar w:fldCharType="end"/>
+        </w:r>
+      </w:hyperlink>
+    </w:p>
+    <w:p>
+      <w:pPr>
+        <w:pStyle w:val="TableofFigures"/>
+        <w:tabs>
+          <w:tab w:val="right" w:leader="dot" w:pos="9350"/>
+        </w:tabs>
+        <w:rPr>
+          <w:rFonts w:eastAsiaTheme="minorEastAsia" w:cstheme="minorBidi"/>
+          <w:i w:val="0"/>
+          <w:iCs w:val="0"/>
+          <w:noProof/>
+          <w:kern w:val="2"/>
+          <w:sz w:val="24"/>
+          <w:szCs w:val="24"/>
+          <w:lang w:val="en-US"/>
+          <w14:ligatures w14:val="standardContextual"/>
+        </w:rPr>
+      </w:pPr>
+      <w:hyperlink w:anchor="_Toc243347121" w:history="1">
+        <w:r>
+          <w:rPr>
+            <w:rStyle w:val="Hyperlink"/>
+            <w:noProof/>
+          </w:rPr>
+          <w:t>Figure 5: Query 2</w:t>
+        </w:r>
+        <w:r>
+          <w:rPr>
+            <w:noProof/>
+            <w:webHidden/>
+          </w:rPr>
+          <w:tab/>
+        </w:r>
+        <w:r>
+          <w:rPr>
+            <w:noProof/>
+            <w:webHidden/>
+          </w:rPr>
+          <w:fldChar w:fldCharType="begin"/>
+        </w:r>
+        <w:r>
+          <w:rPr>
+            <w:noProof/>
+            <w:webHidden/>
+          </w:rPr>
+          <w:instrText xml:space="preserve"> PAGEREF _Toc243347121 \h </w:instrText>
         </w:r>
         <w:r>
           <w:rPr>
@@ -8885,13 +9543,13 @@
           <w14:ligatures w14:val="standardContextual"/>
         </w:rPr>
       </w:pPr>
-      <w:hyperlink w:anchor="_Toc243035820" w:history="1">
+      <w:hyperlink w:anchor="_Toc243347122" w:history="1">
         <w:r>
           <w:rPr>
             <w:rStyle w:val="Hyperlink"/>
             <w:noProof/>
           </w:rPr>
-          <w:t>Figure 4: Output Query 1</w:t>
+          <w:t>Figure 6: Output Query 2</w:t>
         </w:r>
         <w:r>
           <w:rPr>
@@ -8912,7 +9570,7 @@
             <w:noProof/>
             <w:webHidden/>
           </w:rPr>
-          <w:instrText xml:space="preserve"> PAGEREF _Toc243035820 \h </w:instrText>
+          <w:instrText xml:space="preserve"> PAGEREF _Toc243347122 \h </w:instrText>
         </w:r>
         <w:r>
           <w:rPr>
@@ -8961,13 +9619,13 @@
           <w14:ligatures w14:val="standardContextual"/>
         </w:rPr>
       </w:pPr>
-      <w:hyperlink w:anchor="_Toc243035821" w:history="1">
+      <w:hyperlink w:anchor="_Toc243347123" w:history="1">
         <w:r>
           <w:rPr>
             <w:rStyle w:val="Hyperlink"/>
             <w:noProof/>
           </w:rPr>
-          <w:t>Figure 5: Query 2</w:t>
+          <w:t>Figure 7: Query 3</w:t>
         </w:r>
         <w:r>
           <w:rPr>
@@ -8988,7 +9646,7 @@
             <w:noProof/>
             <w:webHidden/>
           </w:rPr>
-          <w:instrText xml:space="preserve"> PAGEREF _Toc243035821 \h </w:instrText>
+          <w:instrText xml:space="preserve"> PAGEREF _Toc243347123 \h </w:instrText>
         </w:r>
         <w:r>
           <w:rPr>
@@ -9037,13 +9695,13 @@
           <w14:ligatures w14:val="standardContextual"/>
         </w:rPr>
       </w:pPr>
-      <w:hyperlink w:anchor="_Toc243035822" w:history="1">
+      <w:hyperlink w:anchor="_Toc243347124" w:history="1">
         <w:r>
           <w:rPr>
             <w:rStyle w:val="Hyperlink"/>
             <w:noProof/>
           </w:rPr>
-          <w:t>Figure 6: Output Query 2</w:t>
+          <w:t>Figure 8: Output Query 3</w:t>
         </w:r>
         <w:r>
           <w:rPr>
@@ -9064,7 +9722,7 @@
             <w:noProof/>
             <w:webHidden/>
           </w:rPr>
-          <w:instrText xml:space="preserve"> PAGEREF _Toc243035822 \h </w:instrText>
+          <w:instrText xml:space="preserve"> PAGEREF _Toc243347124 \h </w:instrText>
         </w:r>
         <w:r>
           <w:rPr>
@@ -9113,13 +9771,13 @@
           <w14:ligatures w14:val="standardContextual"/>
         </w:rPr>
       </w:pPr>
-      <w:hyperlink w:anchor="_Toc243035823" w:history="1">
+      <w:hyperlink w:anchor="_Toc243347125" w:history="1">
         <w:r>
           <w:rPr>
             <w:rStyle w:val="Hyperlink"/>
             <w:noProof/>
           </w:rPr>
-          <w:t>Figure 7: Query 3</w:t>
+          <w:t>Figure 9: Query 4</w:t>
         </w:r>
         <w:r>
           <w:rPr>
@@ -9140,7 +9798,7 @@
             <w:noProof/>
             <w:webHidden/>
           </w:rPr>
-          <w:instrText xml:space="preserve"> PAGEREF _Toc243035823 \h </w:instrText>
+          <w:instrText xml:space="preserve"> PAGEREF _Toc243347125 \h </w:instrText>
         </w:r>
         <w:r>
           <w:rPr>
@@ -9189,13 +9847,13 @@
           <w14:ligatures w14:val="standardContextual"/>
         </w:rPr>
       </w:pPr>
-      <w:hyperlink w:anchor="_Toc243035824" w:history="1">
+      <w:hyperlink w:anchor="_Toc243347126" w:history="1">
         <w:r>
           <w:rPr>
             <w:rStyle w:val="Hyperlink"/>
             <w:noProof/>
           </w:rPr>
-          <w:t>Figure 8: Output Query 3</w:t>
+          <w:t>Figure 10: Output Query 4</w:t>
         </w:r>
         <w:r>
           <w:rPr>
@@ -9216,7 +9874,7 @@
             <w:noProof/>
             <w:webHidden/>
           </w:rPr>
-          <w:instrText xml:space="preserve"> PAGEREF _Toc243035824 \h </w:instrText>
+          <w:instrText xml:space="preserve"> PAGEREF _Toc243347126 \h </w:instrText>
         </w:r>
         <w:r>
           <w:rPr>
@@ -9265,13 +9923,13 @@
           <w14:ligatures w14:val="standardContextual"/>
         </w:rPr>
       </w:pPr>
-      <w:hyperlink w:anchor="_Toc243035825" w:history="1">
+      <w:hyperlink w:anchor="_Toc243347127" w:history="1">
         <w:r>
           <w:rPr>
             <w:rStyle w:val="Hyperlink"/>
             <w:noProof/>
           </w:rPr>
-          <w:t>Figure 9: Query 4</w:t>
+          <w:t>Figure 11: Query 5</w:t>
         </w:r>
         <w:r>
           <w:rPr>
@@ -9292,7 +9950,7 @@
             <w:noProof/>
             <w:webHidden/>
           </w:rPr>
-          <w:instrText xml:space="preserve"> PAGEREF _Toc243035825 \h </w:instrText>
+          <w:instrText xml:space="preserve"> PAGEREF _Toc243347127 \h </w:instrText>
         </w:r>
         <w:r>
           <w:rPr>
@@ -9341,13 +9999,13 @@
           <w14:ligatures w14:val="standardContextual"/>
         </w:rPr>
       </w:pPr>
-      <w:hyperlink w:anchor="_Toc243035826" w:history="1">
+      <w:hyperlink w:anchor="_Toc243347128" w:history="1">
         <w:r>
           <w:rPr>
             <w:rStyle w:val="Hyperlink"/>
             <w:noProof/>
           </w:rPr>
-          <w:t>Figure 10: Output Query 4</w:t>
+          <w:t>Figure 12: Output Query 5</w:t>
         </w:r>
         <w:r>
           <w:rPr>
@@ -9368,7 +10026,7 @@
             <w:noProof/>
             <w:webHidden/>
           </w:rPr>
-          <w:instrText xml:space="preserve"> PAGEREF _Toc243035826 \h </w:instrText>
+          <w:instrText xml:space="preserve"> PAGEREF _Toc243347128 \h </w:instrText>
         </w:r>
         <w:r>
           <w:rPr>
@@ -9400,6 +10058,310 @@
       </w:hyperlink>
     </w:p>
     <w:p>
+      <w:pPr>
+        <w:pStyle w:val="TableofFigures"/>
+        <w:tabs>
+          <w:tab w:val="right" w:leader="dot" w:pos="9350"/>
+        </w:tabs>
+        <w:rPr>
+          <w:rFonts w:eastAsiaTheme="minorEastAsia" w:cstheme="minorBidi"/>
+          <w:i w:val="0"/>
+          <w:iCs w:val="0"/>
+          <w:noProof/>
+          <w:kern w:val="2"/>
+          <w:sz w:val="24"/>
+          <w:szCs w:val="24"/>
+          <w:lang w:val="en-US"/>
+          <w14:ligatures w14:val="standardContextual"/>
+        </w:rPr>
+      </w:pPr>
+      <w:hyperlink w:anchor="_Toc243347129" w:history="1">
+        <w:r>
+          <w:rPr>
+            <w:rStyle w:val="Hyperlink"/>
+            <w:noProof/>
+          </w:rPr>
+          <w:t>Figure 13: Query 6</w:t>
+        </w:r>
+        <w:r>
+          <w:rPr>
+            <w:noProof/>
+            <w:webHidden/>
+          </w:rPr>
+          <w:tab/>
+        </w:r>
+        <w:r>
+          <w:rPr>
+            <w:noProof/>
+            <w:webHidden/>
+          </w:rPr>
+          <w:fldChar w:fldCharType="begin"/>
+        </w:r>
+        <w:r>
+          <w:rPr>
+            <w:noProof/>
+            <w:webHidden/>
+          </w:rPr>
+          <w:instrText xml:space="preserve"> PAGEREF _Toc243347129 \h </w:instrText>
+        </w:r>
+        <w:r>
+          <w:rPr>
+            <w:noProof/>
+            <w:webHidden/>
+          </w:rPr>
+        </w:r>
+        <w:r>
+          <w:rPr>
+            <w:noProof/>
+            <w:webHidden/>
+          </w:rPr>
+          <w:fldChar w:fldCharType="separate"/>
+        </w:r>
+        <w:r>
+          <w:rPr>
+            <w:noProof/>
+            <w:webHidden/>
+          </w:rPr>
+          <w:t>13</w:t>
+        </w:r>
+        <w:r>
+          <w:rPr>
+            <w:noProof/>
+            <w:webHidden/>
+          </w:rPr>
+          <w:fldChar w:fldCharType="end"/>
+        </w:r>
+      </w:hyperlink>
+    </w:p>
+    <w:p>
+      <w:pPr>
+        <w:pStyle w:val="TableofFigures"/>
+        <w:tabs>
+          <w:tab w:val="right" w:leader="dot" w:pos="9350"/>
+        </w:tabs>
+        <w:rPr>
+          <w:rFonts w:eastAsiaTheme="minorEastAsia" w:cstheme="minorBidi"/>
+          <w:i w:val="0"/>
+          <w:iCs w:val="0"/>
+          <w:noProof/>
+          <w:kern w:val="2"/>
+          <w:sz w:val="24"/>
+          <w:szCs w:val="24"/>
+          <w:lang w:val="en-US"/>
+          <w14:ligatures w14:val="standardContextual"/>
+        </w:rPr>
+      </w:pPr>
+      <w:hyperlink w:anchor="_Toc243347130" w:history="1">
+        <w:r>
+          <w:rPr>
+            <w:rStyle w:val="Hyperlink"/>
+            <w:noProof/>
+          </w:rPr>
+          <w:t>Figure 14: Output Query 6</w:t>
+        </w:r>
+        <w:r>
+          <w:rPr>
+            <w:noProof/>
+            <w:webHidden/>
+          </w:rPr>
+          <w:tab/>
+        </w:r>
+        <w:r>
+          <w:rPr>
+            <w:noProof/>
+            <w:webHidden/>
+          </w:rPr>
+          <w:fldChar w:fldCharType="begin"/>
+        </w:r>
+        <w:r>
+          <w:rPr>
+            <w:noProof/>
+            <w:webHidden/>
+          </w:rPr>
+          <w:instrText xml:space="preserve"> PAGEREF _Toc243347130 \h </w:instrText>
+        </w:r>
+        <w:r>
+          <w:rPr>
+            <w:noProof/>
+            <w:webHidden/>
+          </w:rPr>
+        </w:r>
+        <w:r>
+          <w:rPr>
+            <w:noProof/>
+            <w:webHidden/>
+          </w:rPr>
+          <w:fldChar w:fldCharType="separate"/>
+        </w:r>
+        <w:r>
+          <w:rPr>
+            <w:noProof/>
+            <w:webHidden/>
+          </w:rPr>
+          <w:t>13</w:t>
+        </w:r>
+        <w:r>
+          <w:rPr>
+            <w:noProof/>
+            <w:webHidden/>
+          </w:rPr>
+          <w:fldChar w:fldCharType="end"/>
+        </w:r>
+      </w:hyperlink>
+    </w:p>
+    <w:p>
+      <w:pPr>
+        <w:pStyle w:val="TableofFigures"/>
+        <w:tabs>
+          <w:tab w:val="right" w:leader="dot" w:pos="9350"/>
+        </w:tabs>
+        <w:rPr>
+          <w:rFonts w:eastAsiaTheme="minorEastAsia" w:cstheme="minorBidi"/>
+          <w:i w:val="0"/>
+          <w:iCs w:val="0"/>
+          <w:noProof/>
+          <w:kern w:val="2"/>
+          <w:sz w:val="24"/>
+          <w:szCs w:val="24"/>
+          <w:lang w:val="en-US"/>
+          <w14:ligatures w14:val="standardContextual"/>
+        </w:rPr>
+      </w:pPr>
+      <w:hyperlink w:anchor="_Toc243347131" w:history="1">
+        <w:r>
+          <w:rPr>
+            <w:rStyle w:val="Hyperlink"/>
+            <w:noProof/>
+          </w:rPr>
+          <w:t>Figure 15: Query 7</w:t>
+        </w:r>
+        <w:r>
+          <w:rPr>
+            <w:noProof/>
+            <w:webHidden/>
+          </w:rPr>
+          <w:tab/>
+        </w:r>
+        <w:r>
+          <w:rPr>
+            <w:noProof/>
+            <w:webHidden/>
+          </w:rPr>
+          <w:fldChar w:fldCharType="begin"/>
+        </w:r>
+        <w:r>
+          <w:rPr>
+            <w:noProof/>
+            <w:webHidden/>
+          </w:rPr>
+          <w:instrText xml:space="preserve"> PAGEREF _Toc243347131 \h </w:instrText>
+        </w:r>
+        <w:r>
+          <w:rPr>
+            <w:noProof/>
+            <w:webHidden/>
+          </w:rPr>
+        </w:r>
+        <w:r>
+          <w:rPr>
+            <w:noProof/>
+            <w:webHidden/>
+          </w:rPr>
+          <w:fldChar w:fldCharType="separate"/>
+        </w:r>
+        <w:r>
+          <w:rPr>
+            <w:noProof/>
+            <w:webHidden/>
+          </w:rPr>
+          <w:t>14</w:t>
+        </w:r>
+        <w:r>
+          <w:rPr>
+            <w:noProof/>
+            <w:webHidden/>
+          </w:rPr>
+          <w:fldChar w:fldCharType="end"/>
+        </w:r>
+      </w:hyperlink>
+    </w:p>
+    <w:p>
+      <w:pPr>
+        <w:pStyle w:val="TableofFigures"/>
+        <w:tabs>
+          <w:tab w:val="right" w:leader="dot" w:pos="9350"/>
+        </w:tabs>
+        <w:rPr>
+          <w:rFonts w:eastAsiaTheme="minorEastAsia" w:cstheme="minorBidi"/>
+          <w:i w:val="0"/>
+          <w:iCs w:val="0"/>
+          <w:noProof/>
+          <w:kern w:val="2"/>
+          <w:sz w:val="24"/>
+          <w:szCs w:val="24"/>
+          <w:lang w:val="en-US"/>
+          <w14:ligatures w14:val="standardContextual"/>
+        </w:rPr>
+      </w:pPr>
+      <w:hyperlink w:anchor="_Toc243347132" w:history="1">
+        <w:r>
+          <w:rPr>
+            <w:rStyle w:val="Hyperlink"/>
+            <w:noProof/>
+          </w:rPr>
+          <w:t>Figure 16: Output Query 7</w:t>
+        </w:r>
+        <w:r>
+          <w:rPr>
+            <w:noProof/>
+            <w:webHidden/>
+          </w:rPr>
+          <w:tab/>
+        </w:r>
+        <w:r>
+          <w:rPr>
+            <w:noProof/>
+            <w:webHidden/>
+          </w:rPr>
+          <w:fldChar w:fldCharType="begin"/>
+        </w:r>
+        <w:r>
+          <w:rPr>
+            <w:noProof/>
+            <w:webHidden/>
+          </w:rPr>
+          <w:instrText xml:space="preserve"> PAGEREF _Toc243347132 \h </w:instrText>
+        </w:r>
+        <w:r>
+          <w:rPr>
+            <w:noProof/>
+            <w:webHidden/>
+          </w:rPr>
+        </w:r>
+        <w:r>
+          <w:rPr>
+            <w:noProof/>
+            <w:webHidden/>
+          </w:rPr>
+          <w:fldChar w:fldCharType="separate"/>
+        </w:r>
+        <w:r>
+          <w:rPr>
+            <w:noProof/>
+            <w:webHidden/>
+          </w:rPr>
+          <w:t>14</w:t>
+        </w:r>
+        <w:r>
+          <w:rPr>
+            <w:noProof/>
+            <w:webHidden/>
+          </w:rPr>
+          <w:fldChar w:fldCharType="end"/>
+        </w:r>
+      </w:hyperlink>
+    </w:p>
+    <w:p>
       <w:r>
         <w:fldChar w:fldCharType="end"/>
       </w:r>
@@ -9408,12 +10370,12 @@
       <w:pPr>
         <w:pStyle w:val="Heading1"/>
       </w:pPr>
-      <w:bookmarkStart w:id="31" w:name="_Toc243036276"/>
+      <w:bookmarkStart w:id="37" w:name="_Toc243347152"/>
       <w:r>
         <w:t>Bibliography</w:t>
       </w:r>
-      <w:bookmarkEnd w:id="30"/>
-      <w:bookmarkEnd w:id="31"/>
+      <w:bookmarkEnd w:id="36"/>
+      <w:bookmarkEnd w:id="37"/>
     </w:p>
     <w:p>
       <w:r>
@@ -10425,6 +11387,119 @@
       </w:rPr>
     </w:lvl>
   </w:abstractNum>
+  <w:abstractNum w:abstractNumId="7" w15:restartNumberingAfterBreak="0">
+    <w:nsid w:val="7D2C5C0C"/>
+    <w:multiLevelType w:val="hybridMultilevel"/>
+    <w:tmpl w:val="A056874C"/>
+    <w:lvl w:ilvl="0" w:tplc="04090001">
+      <w:start w:val="1"/>
+      <w:numFmt w:val="bullet"/>
+      <w:lvlText w:val=""/>
+      <w:lvlJc w:val="left"/>
+      <w:pPr>
+        <w:ind w:left="720" w:hanging="360"/>
+      </w:pPr>
+      <w:rPr>
+        <w:rFonts w:ascii="Symbol" w:hAnsi="Symbol" w:hint="default"/>
+      </w:rPr>
+    </w:lvl>
+    <w:lvl w:ilvl="1" w:tplc="04090003">
+      <w:start w:val="1"/>
+      <w:numFmt w:val="bullet"/>
+      <w:lvlText w:val="o"/>
+      <w:lvlJc w:val="left"/>
+      <w:pPr>
+        <w:ind w:left="1440" w:hanging="360"/>
+      </w:pPr>
+      <w:rPr>
+        <w:rFonts w:ascii="Courier New" w:hAnsi="Courier New" w:cs="Courier New" w:hint="default"/>
+      </w:rPr>
+    </w:lvl>
+    <w:lvl w:ilvl="2" w:tplc="04090005" w:tentative="1">
+      <w:start w:val="1"/>
+      <w:numFmt w:val="bullet"/>
+      <w:lvlText w:val=""/>
+      <w:lvlJc w:val="left"/>
+      <w:pPr>
+        <w:ind w:left="2160" w:hanging="360"/>
+      </w:pPr>
+      <w:rPr>
+        <w:rFonts w:ascii="Wingdings" w:hAnsi="Wingdings" w:hint="default"/>
+      </w:rPr>
+    </w:lvl>
+    <w:lvl w:ilvl="3" w:tplc="04090001" w:tentative="1">
+      <w:start w:val="1"/>
+      <w:numFmt w:val="bullet"/>
+      <w:lvlText w:val=""/>
+      <w:lvlJc w:val="left"/>
+      <w:pPr>
+        <w:ind w:left="2880" w:hanging="360"/>
+      </w:pPr>
+      <w:rPr>
+        <w:rFonts w:ascii="Symbol" w:hAnsi="Symbol" w:hint="default"/>
+      </w:rPr>
+    </w:lvl>
+    <w:lvl w:ilvl="4" w:tplc="04090003" w:tentative="1">
+      <w:start w:val="1"/>
+      <w:numFmt w:val="bullet"/>
+      <w:lvlText w:val="o"/>
+      <w:lvlJc w:val="left"/>
+      <w:pPr>
+        <w:ind w:left="3600" w:hanging="360"/>
+      </w:pPr>
+      <w:rPr>
+        <w:rFonts w:ascii="Courier New" w:hAnsi="Courier New" w:cs="Courier New" w:hint="default"/>
+      </w:rPr>
+    </w:lvl>
+    <w:lvl w:ilvl="5" w:tplc="04090005" w:tentative="1">
+      <w:start w:val="1"/>
+      <w:numFmt w:val="bullet"/>
+      <w:lvlText w:val=""/>
+      <w:lvlJc w:val="left"/>
+      <w:pPr>
+        <w:ind w:left="4320" w:hanging="360"/>
+      </w:pPr>
+      <w:rPr>
+        <w:rFonts w:ascii="Wingdings" w:hAnsi="Wingdings" w:hint="default"/>
+      </w:rPr>
+    </w:lvl>
+    <w:lvl w:ilvl="6" w:tplc="04090001" w:tentative="1">
+      <w:start w:val="1"/>
+      <w:numFmt w:val="bullet"/>
+      <w:lvlText w:val=""/>
+      <w:lvlJc w:val="left"/>
+      <w:pPr>
+        <w:ind w:left="5040" w:hanging="360"/>
+      </w:pPr>
+      <w:rPr>
+        <w:rFonts w:ascii="Symbol" w:hAnsi="Symbol" w:hint="default"/>
+      </w:rPr>
+    </w:lvl>
+    <w:lvl w:ilvl="7" w:tplc="04090003" w:tentative="1">
+      <w:start w:val="1"/>
+      <w:numFmt w:val="bullet"/>
+      <w:lvlText w:val="o"/>
+      <w:lvlJc w:val="left"/>
+      <w:pPr>
+        <w:ind w:left="5760" w:hanging="360"/>
+      </w:pPr>
+      <w:rPr>
+        <w:rFonts w:ascii="Courier New" w:hAnsi="Courier New" w:cs="Courier New" w:hint="default"/>
+      </w:rPr>
+    </w:lvl>
+    <w:lvl w:ilvl="8" w:tplc="04090005" w:tentative="1">
+      <w:start w:val="1"/>
+      <w:numFmt w:val="bullet"/>
+      <w:lvlText w:val=""/>
+      <w:lvlJc w:val="left"/>
+      <w:pPr>
+        <w:ind w:left="6480" w:hanging="360"/>
+      </w:pPr>
+      <w:rPr>
+        <w:rFonts w:ascii="Wingdings" w:hAnsi="Wingdings" w:hint="default"/>
+      </w:rPr>
+    </w:lvl>
+  </w:abstractNum>
   <w:num w:numId="1" w16cid:durableId="1778988322">
     <w:abstractNumId w:val="4"/>
   </w:num>
@@ -10445,6 +11520,9 @@
   </w:num>
   <w:num w:numId="7" w16cid:durableId="1358234669">
     <w:abstractNumId w:val="1"/>
+  </w:num>
+  <w:num w:numId="8" w16cid:durableId="638649970">
+    <w:abstractNumId w:val="7"/>
   </w:num>
 </w:numbering>
 </file>
@@ -11981,13 +13059,13 @@
 </file>
 
 <file path=customXml/item2.xml><?xml version="1.0" encoding="utf-8"?>
-<b:Sources xmlns:b="http://schemas.openxmlformats.org/officeDocument/2006/bibliography" xmlns="http://schemas.openxmlformats.org/officeDocument/2006/bibliography" SelectedStyle="\APASixthEditionOfficeOnline.xsl" StyleName="APA" Version="6"/>
+<go:gDocsCustomXmlDataStorage xmlns:go="http://customooxmlschemas.google.com/" xmlns:r="http://schemas.openxmlformats.org/officeDocument/2006/relationships" uri="GoogleDocsCustomDataVersion2">
+  <go:docsCustomData xmlns:go="http://customooxmlschemas.google.com/" roundtripDataSignature="AMtx7miowNiEiok9Q4hfnSc9J9e4yhu0dw==">CgMxLjAyDmgubTJyMWVwNncxczliMg5oLmpzcG1pbnFjcXdnNDIOaC5ydmQ1dGt1NWNoNGoyDmguODRsZW9oYmJ4enA4Mg5oLjdjZjZsNTluYmFhbzIOaC40M2VhbjNyajc2YngyDmgucGk3aXJ1bWExZm9mMg5oLmRuazYwbmRodjZkbzIOaC5lbnRxMGFtZTg3cWkyDmgub3IxcnNiYXkzYzB0Mg5oLjZpbzJxNXUxb2ZpNjIPaWQuaTJpdHZidGQxZmd0Mg5oLmVwMDF1cThidjZ5ZzINaC5iZjN0Mm9keWx1aTIOaC5uZXpsZGNtY3A1bG84AHIhMXdoQWJ2LXpnVE95dGRfOTRpRWlqT2ZlMDlkTkl1UUZB</go:docsCustomData>
+</go:gDocsCustomXmlDataStorage>
 </file>
 
 <file path=customXml/item3.xml><?xml version="1.0" encoding="utf-8"?>
-<go:gDocsCustomXmlDataStorage xmlns:go="http://customooxmlschemas.google.com/" xmlns:r="http://schemas.openxmlformats.org/officeDocument/2006/relationships" uri="GoogleDocsCustomDataVersion2">
-  <go:docsCustomData xmlns:go="http://customooxmlschemas.google.com/" roundtripDataSignature="AMtx7miowNiEiok9Q4hfnSc9J9e4yhu0dw==">CgMxLjAyDmgubTJyMWVwNncxczliMg5oLmpzcG1pbnFjcXdnNDIOaC5ydmQ1dGt1NWNoNGoyDmguODRsZW9oYmJ4enA4Mg5oLjdjZjZsNTluYmFhbzIOaC40M2VhbjNyajc2YngyDmgucGk3aXJ1bWExZm9mMg5oLmRuazYwbmRodjZkbzIOaC5lbnRxMGFtZTg3cWkyDmgub3IxcnNiYXkzYzB0Mg5oLjZpbzJxNXUxb2ZpNjIPaWQuaTJpdHZidGQxZmd0Mg5oLmVwMDF1cThidjZ5ZzINaC5iZjN0Mm9keWx1aTIOaC5uZXpsZGNtY3A1bG84AHIhMXdoQWJ2LXpnVE95dGRfOTRpRWlqT2ZlMDlkTkl1UUZB</go:docsCustomData>
-</go:gDocsCustomXmlDataStorage>
+<b:Sources xmlns:b="http://schemas.openxmlformats.org/officeDocument/2006/bibliography" xmlns="http://schemas.openxmlformats.org/officeDocument/2006/bibliography" SelectedStyle="\APASixthEditionOfficeOnline.xsl" StyleName="APA" Version="6"/>
 </file>
 
 <file path=customXml/itemProps1.xml><?xml version="1.0" encoding="utf-8"?>
@@ -11999,18 +13077,18 @@
 </file>
 
 <file path=customXml/itemProps2.xml><?xml version="1.0" encoding="utf-8"?>
-<ds:datastoreItem xmlns:ds="http://schemas.openxmlformats.org/officeDocument/2006/customXml" ds:itemID="{8459E5D0-7ACB-4FF4-B3A2-F80FBCC9791B}">
-  <ds:schemaRefs>
-    <ds:schemaRef ds:uri="http://schemas.openxmlformats.org/officeDocument/2006/bibliography"/>
-  </ds:schemaRefs>
-</ds:datastoreItem>
-</file>
-
-<file path=customXml/itemProps3.xml><?xml version="1.0" encoding="utf-8"?>
 <ds:datastoreItem xmlns:ds="http://schemas.openxmlformats.org/officeDocument/2006/customXml" ds:itemID="{11111111-1234-1234-1234-123412341234}">
   <ds:schemaRefs>
     <ds:schemaRef ds:uri="http://customooxmlschemas.google.com/"/>
     <ds:schemaRef ds:uri="http://schemas.openxmlformats.org/officeDocument/2006/relationships"/>
   </ds:schemaRefs>
 </ds:datastoreItem>
+</file>
+
+<file path=customXml/itemProps3.xml><?xml version="1.0" encoding="utf-8"?>
+<ds:datastoreItem xmlns:ds="http://schemas.openxmlformats.org/officeDocument/2006/customXml" ds:itemID="{8459E5D0-7ACB-4FF4-B3A2-F80FBCC9791B}">
+  <ds:schemaRefs>
+    <ds:schemaRef ds:uri="http://schemas.openxmlformats.org/officeDocument/2006/bibliography"/>
+  </ds:schemaRefs>
+</ds:datastoreItem>
 </file>
</xml_diff>

<commit_message>
Project First Draft Report
</commit_message>
<xml_diff>
--- a/SOEN363_Project_Phase1_DatabaseGuru.docx
+++ b/SOEN363_Project_Phase1_DatabaseGuru.docx
@@ -330,7 +330,25 @@
                                               <w:sz w:val="26"/>
                                               <w:szCs w:val="26"/>
                                             </w:rPr>
-                                            <w:t xml:space="preserve"> StudentID: 25745616</w:t>
+                                            <w:t xml:space="preserve"> </w:t>
+                                          </w:r>
+                                          <w:proofErr w:type="spellStart"/>
+                                          <w:r>
+                                            <w:rPr>
+                                              <w:color w:val="E97132" w:themeColor="accent2"/>
+                                              <w:sz w:val="26"/>
+                                              <w:szCs w:val="26"/>
+                                            </w:rPr>
+                                            <w:t>StudentID</w:t>
+                                          </w:r>
+                                          <w:proofErr w:type="spellEnd"/>
+                                          <w:r>
+                                            <w:rPr>
+                                              <w:color w:val="E97132" w:themeColor="accent2"/>
+                                              <w:sz w:val="26"/>
+                                              <w:szCs w:val="26"/>
+                                            </w:rPr>
+                                            <w:t>: 25745616</w:t>
                                           </w:r>
                                           <w:r>
                                             <w:rPr>
@@ -346,7 +364,25 @@
                                               <w:sz w:val="26"/>
                                               <w:szCs w:val="26"/>
                                             </w:rPr>
-                                            <w:t xml:space="preserve"> StudentID:</w:t>
+                                            <w:t xml:space="preserve"> </w:t>
+                                          </w:r>
+                                          <w:proofErr w:type="spellStart"/>
+                                          <w:r>
+                                            <w:rPr>
+                                              <w:color w:val="E97132" w:themeColor="accent2"/>
+                                              <w:sz w:val="26"/>
+                                              <w:szCs w:val="26"/>
+                                            </w:rPr>
+                                            <w:t>StudentID</w:t>
+                                          </w:r>
+                                          <w:proofErr w:type="spellEnd"/>
+                                          <w:r>
+                                            <w:rPr>
+                                              <w:color w:val="E97132" w:themeColor="accent2"/>
+                                              <w:sz w:val="26"/>
+                                              <w:szCs w:val="26"/>
+                                            </w:rPr>
+                                            <w:t>:</w:t>
                                           </w:r>
                                           <w:r>
                                             <w:rPr>
@@ -362,8 +398,18 @@
                                               <w:sz w:val="26"/>
                                               <w:szCs w:val="26"/>
                                             </w:rPr>
-                                            <w:t xml:space="preserve"> StudentID</w:t>
+                                            <w:t xml:space="preserve"> </w:t>
                                           </w:r>
+                                          <w:proofErr w:type="spellStart"/>
+                                          <w:r>
+                                            <w:rPr>
+                                              <w:color w:val="E97132" w:themeColor="accent2"/>
+                                              <w:sz w:val="26"/>
+                                              <w:szCs w:val="26"/>
+                                            </w:rPr>
+                                            <w:t>StudentID</w:t>
+                                          </w:r>
+                                          <w:proofErr w:type="spellEnd"/>
                                           <w:r>
                                             <w:rPr>
                                               <w:color w:val="E97132" w:themeColor="accent2"/>
@@ -394,8 +440,18 @@
                                               <w:sz w:val="26"/>
                                               <w:szCs w:val="26"/>
                                             </w:rPr>
-                                            <w:t xml:space="preserve"> StudentID</w:t>
+                                            <w:t xml:space="preserve"> </w:t>
                                           </w:r>
+                                          <w:proofErr w:type="spellStart"/>
+                                          <w:r>
+                                            <w:rPr>
+                                              <w:color w:val="E97132" w:themeColor="accent2"/>
+                                              <w:sz w:val="26"/>
+                                              <w:szCs w:val="26"/>
+                                            </w:rPr>
+                                            <w:t>StudentID</w:t>
+                                          </w:r>
+                                          <w:proofErr w:type="spellEnd"/>
                                         </w:p>
                                       </w:sdtContent>
                                     </w:sdt>
@@ -710,7 +766,25 @@
                                         <w:sz w:val="26"/>
                                         <w:szCs w:val="26"/>
                                       </w:rPr>
-                                      <w:t xml:space="preserve"> StudentID: 25745616</w:t>
+                                      <w:t xml:space="preserve"> </w:t>
+                                    </w:r>
+                                    <w:proofErr w:type="spellStart"/>
+                                    <w:r>
+                                      <w:rPr>
+                                        <w:color w:val="E97132" w:themeColor="accent2"/>
+                                        <w:sz w:val="26"/>
+                                        <w:szCs w:val="26"/>
+                                      </w:rPr>
+                                      <w:t>StudentID</w:t>
+                                    </w:r>
+                                    <w:proofErr w:type="spellEnd"/>
+                                    <w:r>
+                                      <w:rPr>
+                                        <w:color w:val="E97132" w:themeColor="accent2"/>
+                                        <w:sz w:val="26"/>
+                                        <w:szCs w:val="26"/>
+                                      </w:rPr>
+                                      <w:t>: 25745616</w:t>
                                     </w:r>
                                     <w:r>
                                       <w:rPr>
@@ -726,7 +800,25 @@
                                         <w:sz w:val="26"/>
                                         <w:szCs w:val="26"/>
                                       </w:rPr>
-                                      <w:t xml:space="preserve"> StudentID:</w:t>
+                                      <w:t xml:space="preserve"> </w:t>
+                                    </w:r>
+                                    <w:proofErr w:type="spellStart"/>
+                                    <w:r>
+                                      <w:rPr>
+                                        <w:color w:val="E97132" w:themeColor="accent2"/>
+                                        <w:sz w:val="26"/>
+                                        <w:szCs w:val="26"/>
+                                      </w:rPr>
+                                      <w:t>StudentID</w:t>
+                                    </w:r>
+                                    <w:proofErr w:type="spellEnd"/>
+                                    <w:r>
+                                      <w:rPr>
+                                        <w:color w:val="E97132" w:themeColor="accent2"/>
+                                        <w:sz w:val="26"/>
+                                        <w:szCs w:val="26"/>
+                                      </w:rPr>
+                                      <w:t>:</w:t>
                                     </w:r>
                                     <w:r>
                                       <w:rPr>
@@ -742,8 +834,18 @@
                                         <w:sz w:val="26"/>
                                         <w:szCs w:val="26"/>
                                       </w:rPr>
-                                      <w:t xml:space="preserve"> StudentID</w:t>
+                                      <w:t xml:space="preserve"> </w:t>
                                     </w:r>
+                                    <w:proofErr w:type="spellStart"/>
+                                    <w:r>
+                                      <w:rPr>
+                                        <w:color w:val="E97132" w:themeColor="accent2"/>
+                                        <w:sz w:val="26"/>
+                                        <w:szCs w:val="26"/>
+                                      </w:rPr>
+                                      <w:t>StudentID</w:t>
+                                    </w:r>
+                                    <w:proofErr w:type="spellEnd"/>
                                     <w:r>
                                       <w:rPr>
                                         <w:color w:val="E97132" w:themeColor="accent2"/>
@@ -774,8 +876,18 @@
                                         <w:sz w:val="26"/>
                                         <w:szCs w:val="26"/>
                                       </w:rPr>
-                                      <w:t xml:space="preserve"> StudentID</w:t>
+                                      <w:t xml:space="preserve"> </w:t>
                                     </w:r>
+                                    <w:proofErr w:type="spellStart"/>
+                                    <w:r>
+                                      <w:rPr>
+                                        <w:color w:val="E97132" w:themeColor="accent2"/>
+                                        <w:sz w:val="26"/>
+                                        <w:szCs w:val="26"/>
+                                      </w:rPr>
+                                      <w:t>StudentID</w:t>
+                                    </w:r>
+                                    <w:proofErr w:type="spellEnd"/>
                                   </w:p>
                                 </w:sdtContent>
                               </w:sdt>
@@ -1753,27 +1865,14 @@
       <w:r>
         <w:t xml:space="preserve">Figure </w:t>
       </w:r>
-      <w:r>
-        <w:fldChar w:fldCharType="begin"/>
-      </w:r>
-      <w:r>
-        <w:instrText xml:space="preserve"> SEQ Figure \* ARABIC </w:instrText>
-      </w:r>
-      <w:r>
-        <w:fldChar w:fldCharType="separate"/>
-      </w:r>
-      <w:r>
-        <w:rPr>
-          <w:noProof/>
-        </w:rPr>
-        <w:t>1</w:t>
-      </w:r>
-      <w:r>
-        <w:rPr>
-          <w:noProof/>
-        </w:rPr>
-        <w:fldChar w:fldCharType="end"/>
-      </w:r>
+      <w:fldSimple w:instr=" SEQ Figure \* ARABIC ">
+        <w:r>
+          <w:rPr>
+            <w:noProof/>
+          </w:rPr>
+          <w:t>1</w:t>
+        </w:r>
+      </w:fldSimple>
       <w:r>
         <w:t>: ER Diagram</w:t>
       </w:r>
@@ -2815,27 +2914,14 @@
       <w:r>
         <w:t xml:space="preserve">Figure </w:t>
       </w:r>
-      <w:r>
-        <w:fldChar w:fldCharType="begin"/>
-      </w:r>
-      <w:r>
-        <w:instrText xml:space="preserve"> SEQ Figure \* ARABIC </w:instrText>
-      </w:r>
-      <w:r>
-        <w:fldChar w:fldCharType="separate"/>
-      </w:r>
-      <w:r>
-        <w:rPr>
-          <w:noProof/>
-        </w:rPr>
-        <w:t>2</w:t>
-      </w:r>
-      <w:r>
-        <w:rPr>
-          <w:noProof/>
-        </w:rPr>
-        <w:fldChar w:fldCharType="end"/>
-      </w:r>
+      <w:fldSimple w:instr=" SEQ Figure \* ARABIC ">
+        <w:r>
+          <w:rPr>
+            <w:noProof/>
+          </w:rPr>
+          <w:t>2</w:t>
+        </w:r>
+      </w:fldSimple>
       <w:r>
         <w:t>: Database Statistics</w:t>
       </w:r>
@@ -3253,27 +3339,14 @@
       <w:r>
         <w:t xml:space="preserve">Figure </w:t>
       </w:r>
-      <w:r>
-        <w:fldChar w:fldCharType="begin"/>
-      </w:r>
-      <w:r>
-        <w:instrText xml:space="preserve"> SEQ Figure \* ARABIC </w:instrText>
-      </w:r>
-      <w:r>
-        <w:fldChar w:fldCharType="separate"/>
-      </w:r>
-      <w:r>
-        <w:rPr>
-          <w:noProof/>
-        </w:rPr>
-        <w:t>3</w:t>
-      </w:r>
-      <w:r>
-        <w:rPr>
-          <w:noProof/>
-        </w:rPr>
-        <w:fldChar w:fldCharType="end"/>
-      </w:r>
+      <w:fldSimple w:instr=" SEQ Figure \* ARABIC ">
+        <w:r>
+          <w:rPr>
+            <w:noProof/>
+          </w:rPr>
+          <w:t>3</w:t>
+        </w:r>
+      </w:fldSimple>
       <w:r>
         <w:t>: Query 1</w:t>
       </w:r>
@@ -3357,27 +3430,14 @@
       <w:r>
         <w:t xml:space="preserve">Figure </w:t>
       </w:r>
-      <w:r>
-        <w:fldChar w:fldCharType="begin"/>
-      </w:r>
-      <w:r>
-        <w:instrText xml:space="preserve"> SEQ Figure \* ARABIC </w:instrText>
-      </w:r>
-      <w:r>
-        <w:fldChar w:fldCharType="separate"/>
-      </w:r>
-      <w:r>
-        <w:rPr>
-          <w:noProof/>
-        </w:rPr>
-        <w:t>4</w:t>
-      </w:r>
-      <w:r>
-        <w:rPr>
-          <w:noProof/>
-        </w:rPr>
-        <w:fldChar w:fldCharType="end"/>
-      </w:r>
+      <w:fldSimple w:instr=" SEQ Figure \* ARABIC ">
+        <w:r>
+          <w:rPr>
+            <w:noProof/>
+          </w:rPr>
+          <w:t>4</w:t>
+        </w:r>
+      </w:fldSimple>
       <w:r>
         <w:t>: Output Query 1</w:t>
       </w:r>
@@ -3703,27 +3763,14 @@
       <w:r>
         <w:t xml:space="preserve">Figure </w:t>
       </w:r>
-      <w:r>
-        <w:fldChar w:fldCharType="begin"/>
-      </w:r>
-      <w:r>
-        <w:instrText xml:space="preserve"> SEQ Figure \* ARABIC </w:instrText>
-      </w:r>
-      <w:r>
-        <w:fldChar w:fldCharType="separate"/>
-      </w:r>
-      <w:r>
-        <w:rPr>
-          <w:noProof/>
-        </w:rPr>
-        <w:t>5</w:t>
-      </w:r>
-      <w:r>
-        <w:rPr>
-          <w:noProof/>
-        </w:rPr>
-        <w:fldChar w:fldCharType="end"/>
-      </w:r>
+      <w:fldSimple w:instr=" SEQ Figure \* ARABIC ">
+        <w:r>
+          <w:rPr>
+            <w:noProof/>
+          </w:rPr>
+          <w:t>5</w:t>
+        </w:r>
+      </w:fldSimple>
       <w:r>
         <w:t>: Query 2</w:t>
       </w:r>
@@ -3840,27 +3887,14 @@
       <w:r>
         <w:t xml:space="preserve">Figure </w:t>
       </w:r>
-      <w:r>
-        <w:fldChar w:fldCharType="begin"/>
-      </w:r>
-      <w:r>
-        <w:instrText xml:space="preserve"> SEQ Figure \* ARABIC </w:instrText>
-      </w:r>
-      <w:r>
-        <w:fldChar w:fldCharType="separate"/>
-      </w:r>
-      <w:r>
-        <w:rPr>
-          <w:noProof/>
-        </w:rPr>
-        <w:t>6</w:t>
-      </w:r>
-      <w:r>
-        <w:rPr>
-          <w:noProof/>
-        </w:rPr>
-        <w:fldChar w:fldCharType="end"/>
-      </w:r>
+      <w:fldSimple w:instr=" SEQ Figure \* ARABIC ">
+        <w:r>
+          <w:rPr>
+            <w:noProof/>
+          </w:rPr>
+          <w:t>6</w:t>
+        </w:r>
+      </w:fldSimple>
       <w:r>
         <w:t>: Output Query 2</w:t>
       </w:r>
@@ -4210,27 +4244,14 @@
       <w:r>
         <w:t xml:space="preserve">Figure </w:t>
       </w:r>
-      <w:r>
-        <w:fldChar w:fldCharType="begin"/>
-      </w:r>
-      <w:r>
-        <w:instrText xml:space="preserve"> SEQ Figure \* ARABIC </w:instrText>
-      </w:r>
-      <w:r>
-        <w:fldChar w:fldCharType="separate"/>
-      </w:r>
-      <w:r>
-        <w:rPr>
-          <w:noProof/>
-        </w:rPr>
-        <w:t>7</w:t>
-      </w:r>
-      <w:r>
-        <w:rPr>
-          <w:noProof/>
-        </w:rPr>
-        <w:fldChar w:fldCharType="end"/>
-      </w:r>
+      <w:fldSimple w:instr=" SEQ Figure \* ARABIC ">
+        <w:r>
+          <w:rPr>
+            <w:noProof/>
+          </w:rPr>
+          <w:t>7</w:t>
+        </w:r>
+      </w:fldSimple>
       <w:r>
         <w:t>: Query 3</w:t>
       </w:r>
@@ -4325,27 +4346,14 @@
       <w:r>
         <w:t xml:space="preserve">Figure </w:t>
       </w:r>
-      <w:r>
-        <w:fldChar w:fldCharType="begin"/>
-      </w:r>
-      <w:r>
-        <w:instrText xml:space="preserve"> SEQ Figure \* ARABIC </w:instrText>
-      </w:r>
-      <w:r>
-        <w:fldChar w:fldCharType="separate"/>
-      </w:r>
-      <w:r>
-        <w:rPr>
-          <w:noProof/>
-        </w:rPr>
-        <w:t>8</w:t>
-      </w:r>
-      <w:r>
-        <w:rPr>
-          <w:noProof/>
-        </w:rPr>
-        <w:fldChar w:fldCharType="end"/>
-      </w:r>
+      <w:fldSimple w:instr=" SEQ Figure \* ARABIC ">
+        <w:r>
+          <w:rPr>
+            <w:noProof/>
+          </w:rPr>
+          <w:t>8</w:t>
+        </w:r>
+      </w:fldSimple>
       <w:r>
         <w:t>: Output Query 3</w:t>
       </w:r>
@@ -4581,27 +4589,14 @@
       <w:r>
         <w:t xml:space="preserve">Figure </w:t>
       </w:r>
-      <w:r>
-        <w:fldChar w:fldCharType="begin"/>
-      </w:r>
-      <w:r>
-        <w:instrText xml:space="preserve"> SEQ Figure \* ARABIC </w:instrText>
-      </w:r>
-      <w:r>
-        <w:fldChar w:fldCharType="separate"/>
-      </w:r>
-      <w:r>
-        <w:rPr>
-          <w:noProof/>
-        </w:rPr>
-        <w:t>9</w:t>
-      </w:r>
-      <w:r>
-        <w:rPr>
-          <w:noProof/>
-        </w:rPr>
-        <w:fldChar w:fldCharType="end"/>
-      </w:r>
+      <w:fldSimple w:instr=" SEQ Figure \* ARABIC ">
+        <w:r>
+          <w:rPr>
+            <w:noProof/>
+          </w:rPr>
+          <w:t>9</w:t>
+        </w:r>
+      </w:fldSimple>
       <w:r>
         <w:t>: Query 4</w:t>
       </w:r>
@@ -4706,27 +4701,14 @@
       <w:r>
         <w:t xml:space="preserve">Figure </w:t>
       </w:r>
-      <w:r>
-        <w:fldChar w:fldCharType="begin"/>
-      </w:r>
-      <w:r>
-        <w:instrText xml:space="preserve"> SEQ Figure \* ARABIC </w:instrText>
-      </w:r>
-      <w:r>
-        <w:fldChar w:fldCharType="separate"/>
-      </w:r>
-      <w:r>
-        <w:rPr>
-          <w:noProof/>
-        </w:rPr>
-        <w:t>10</w:t>
-      </w:r>
-      <w:r>
-        <w:rPr>
-          <w:noProof/>
-        </w:rPr>
-        <w:fldChar w:fldCharType="end"/>
-      </w:r>
+      <w:fldSimple w:instr=" SEQ Figure \* ARABIC ">
+        <w:r>
+          <w:rPr>
+            <w:noProof/>
+          </w:rPr>
+          <w:t>10</w:t>
+        </w:r>
+      </w:fldSimple>
       <w:r>
         <w:t>: Output Query 4</w:t>
       </w:r>
@@ -4893,6 +4875,7 @@
         </w:rPr>
         <w:t xml:space="preserve"> the patient id. After that, for the diagnostic order, </w:t>
       </w:r>
+      <w:proofErr w:type="spellStart"/>
       <w:proofErr w:type="gramStart"/>
       <w:r>
         <w:rPr>
@@ -4901,6 +4884,7 @@
         </w:rPr>
         <w:t>its</w:t>
       </w:r>
+      <w:proofErr w:type="spellEnd"/>
       <w:proofErr w:type="gramEnd"/>
       <w:r>
         <w:rPr>
@@ -4973,24 +4957,14 @@
       <w:r>
         <w:t xml:space="preserve">Figure </w:t>
       </w:r>
-      <w:r>
-        <w:fldChar w:fldCharType="begin"/>
-      </w:r>
-      <w:r>
-        <w:instrText xml:space="preserve"> SEQ Figure \* ARABIC </w:instrText>
-      </w:r>
-      <w:r>
-        <w:fldChar w:fldCharType="separate"/>
-      </w:r>
-      <w:r>
-        <w:rPr>
-          <w:noProof/>
-        </w:rPr>
-        <w:t>11</w:t>
-      </w:r>
-      <w:r>
-        <w:fldChar w:fldCharType="end"/>
-      </w:r>
+      <w:fldSimple w:instr=" SEQ Figure \* ARABIC ">
+        <w:r>
+          <w:rPr>
+            <w:noProof/>
+          </w:rPr>
+          <w:t>11</w:t>
+        </w:r>
+      </w:fldSimple>
       <w:r>
         <w:t>: Query 5</w:t>
       </w:r>
@@ -5075,24 +5049,14 @@
       <w:r>
         <w:t xml:space="preserve">Figure </w:t>
       </w:r>
-      <w:r>
-        <w:fldChar w:fldCharType="begin"/>
-      </w:r>
-      <w:r>
-        <w:instrText xml:space="preserve"> SEQ Figure \* ARABIC </w:instrText>
-      </w:r>
-      <w:r>
-        <w:fldChar w:fldCharType="separate"/>
-      </w:r>
-      <w:r>
-        <w:rPr>
-          <w:noProof/>
-        </w:rPr>
-        <w:t>12</w:t>
-      </w:r>
-      <w:r>
-        <w:fldChar w:fldCharType="end"/>
-      </w:r>
+      <w:fldSimple w:instr=" SEQ Figure \* ARABIC ">
+        <w:r>
+          <w:rPr>
+            <w:noProof/>
+          </w:rPr>
+          <w:t>12</w:t>
+        </w:r>
+      </w:fldSimple>
       <w:r>
         <w:t>: Output Query 5</w:t>
       </w:r>
@@ -5271,24 +5235,14 @@
       <w:r>
         <w:t xml:space="preserve">Figure </w:t>
       </w:r>
-      <w:r>
-        <w:fldChar w:fldCharType="begin"/>
-      </w:r>
-      <w:r>
-        <w:instrText xml:space="preserve"> SEQ Figure \* ARABIC </w:instrText>
-      </w:r>
-      <w:r>
-        <w:fldChar w:fldCharType="separate"/>
-      </w:r>
-      <w:r>
-        <w:rPr>
-          <w:noProof/>
-        </w:rPr>
-        <w:t>13</w:t>
-      </w:r>
-      <w:r>
-        <w:fldChar w:fldCharType="end"/>
-      </w:r>
+      <w:fldSimple w:instr=" SEQ Figure \* ARABIC ">
+        <w:r>
+          <w:rPr>
+            <w:noProof/>
+          </w:rPr>
+          <w:t>13</w:t>
+        </w:r>
+      </w:fldSimple>
       <w:r>
         <w:t>: Query 6</w:t>
       </w:r>
@@ -5365,24 +5319,14 @@
       <w:r>
         <w:t xml:space="preserve">Figure </w:t>
       </w:r>
-      <w:r>
-        <w:fldChar w:fldCharType="begin"/>
-      </w:r>
-      <w:r>
-        <w:instrText xml:space="preserve"> SEQ Figure \* ARABIC </w:instrText>
-      </w:r>
-      <w:r>
-        <w:fldChar w:fldCharType="separate"/>
-      </w:r>
-      <w:r>
-        <w:rPr>
-          <w:noProof/>
-        </w:rPr>
-        <w:t>14</w:t>
-      </w:r>
-      <w:r>
-        <w:fldChar w:fldCharType="end"/>
-      </w:r>
+      <w:fldSimple w:instr=" SEQ Figure \* ARABIC ">
+        <w:r>
+          <w:rPr>
+            <w:noProof/>
+          </w:rPr>
+          <w:t>14</w:t>
+        </w:r>
+      </w:fldSimple>
       <w:r>
         <w:t>: Output Query 6</w:t>
       </w:r>
@@ -5572,24 +5516,14 @@
       <w:r>
         <w:t xml:space="preserve">Figure </w:t>
       </w:r>
-      <w:r>
-        <w:fldChar w:fldCharType="begin"/>
-      </w:r>
-      <w:r>
-        <w:instrText xml:space="preserve"> SEQ Figure \* ARABIC </w:instrText>
-      </w:r>
-      <w:r>
-        <w:fldChar w:fldCharType="separate"/>
-      </w:r>
-      <w:r>
-        <w:rPr>
-          <w:noProof/>
-        </w:rPr>
-        <w:t>15</w:t>
-      </w:r>
-      <w:r>
-        <w:fldChar w:fldCharType="end"/>
-      </w:r>
+      <w:fldSimple w:instr=" SEQ Figure \* ARABIC ">
+        <w:r>
+          <w:rPr>
+            <w:noProof/>
+          </w:rPr>
+          <w:t>15</w:t>
+        </w:r>
+      </w:fldSimple>
       <w:r>
         <w:t>: Query 7</w:t>
       </w:r>
@@ -5678,24 +5612,14 @@
       <w:r>
         <w:t xml:space="preserve">Figure </w:t>
       </w:r>
-      <w:r>
-        <w:fldChar w:fldCharType="begin"/>
-      </w:r>
-      <w:r>
-        <w:instrText xml:space="preserve"> SEQ Figure \* ARABIC </w:instrText>
-      </w:r>
-      <w:r>
-        <w:fldChar w:fldCharType="separate"/>
-      </w:r>
-      <w:r>
-        <w:rPr>
-          <w:noProof/>
-        </w:rPr>
-        <w:t>16</w:t>
-      </w:r>
-      <w:r>
-        <w:fldChar w:fldCharType="end"/>
-      </w:r>
+      <w:fldSimple w:instr=" SEQ Figure \* ARABIC ">
+        <w:r>
+          <w:rPr>
+            <w:noProof/>
+          </w:rPr>
+          <w:t>16</w:t>
+        </w:r>
+      </w:fldSimple>
       <w:r>
         <w:t>: Output Query 7</w:t>
       </w:r>
@@ -13059,13 +12983,13 @@
 </file>
 
 <file path=customXml/item2.xml><?xml version="1.0" encoding="utf-8"?>
+<b:Sources xmlns:b="http://schemas.openxmlformats.org/officeDocument/2006/bibliography" xmlns="http://schemas.openxmlformats.org/officeDocument/2006/bibliography" SelectedStyle="\APASixthEditionOfficeOnline.xsl" StyleName="APA" Version="6"/>
+</file>
+
+<file path=customXml/item3.xml><?xml version="1.0" encoding="utf-8"?>
 <go:gDocsCustomXmlDataStorage xmlns:go="http://customooxmlschemas.google.com/" xmlns:r="http://schemas.openxmlformats.org/officeDocument/2006/relationships" uri="GoogleDocsCustomDataVersion2">
   <go:docsCustomData xmlns:go="http://customooxmlschemas.google.com/" roundtripDataSignature="AMtx7miowNiEiok9Q4hfnSc9J9e4yhu0dw==">CgMxLjAyDmgubTJyMWVwNncxczliMg5oLmpzcG1pbnFjcXdnNDIOaC5ydmQ1dGt1NWNoNGoyDmguODRsZW9oYmJ4enA4Mg5oLjdjZjZsNTluYmFhbzIOaC40M2VhbjNyajc2YngyDmgucGk3aXJ1bWExZm9mMg5oLmRuazYwbmRodjZkbzIOaC5lbnRxMGFtZTg3cWkyDmgub3IxcnNiYXkzYzB0Mg5oLjZpbzJxNXUxb2ZpNjIPaWQuaTJpdHZidGQxZmd0Mg5oLmVwMDF1cThidjZ5ZzINaC5iZjN0Mm9keWx1aTIOaC5uZXpsZGNtY3A1bG84AHIhMXdoQWJ2LXpnVE95dGRfOTRpRWlqT2ZlMDlkTkl1UUZB</go:docsCustomData>
 </go:gDocsCustomXmlDataStorage>
-</file>
-
-<file path=customXml/item3.xml><?xml version="1.0" encoding="utf-8"?>
-<b:Sources xmlns:b="http://schemas.openxmlformats.org/officeDocument/2006/bibliography" xmlns="http://schemas.openxmlformats.org/officeDocument/2006/bibliography" SelectedStyle="\APASixthEditionOfficeOnline.xsl" StyleName="APA" Version="6"/>
 </file>
 
 <file path=customXml/itemProps1.xml><?xml version="1.0" encoding="utf-8"?>
@@ -13077,18 +13001,18 @@
 </file>
 
 <file path=customXml/itemProps2.xml><?xml version="1.0" encoding="utf-8"?>
+<ds:datastoreItem xmlns:ds="http://schemas.openxmlformats.org/officeDocument/2006/customXml" ds:itemID="{8459E5D0-7ACB-4FF4-B3A2-F80FBCC9791B}">
+  <ds:schemaRefs>
+    <ds:schemaRef ds:uri="http://schemas.openxmlformats.org/officeDocument/2006/bibliography"/>
+  </ds:schemaRefs>
+</ds:datastoreItem>
+</file>
+
+<file path=customXml/itemProps3.xml><?xml version="1.0" encoding="utf-8"?>
 <ds:datastoreItem xmlns:ds="http://schemas.openxmlformats.org/officeDocument/2006/customXml" ds:itemID="{11111111-1234-1234-1234-123412341234}">
   <ds:schemaRefs>
     <ds:schemaRef ds:uri="http://customooxmlschemas.google.com/"/>
     <ds:schemaRef ds:uri="http://schemas.openxmlformats.org/officeDocument/2006/relationships"/>
   </ds:schemaRefs>
 </ds:datastoreItem>
-</file>
-
-<file path=customXml/itemProps3.xml><?xml version="1.0" encoding="utf-8"?>
-<ds:datastoreItem xmlns:ds="http://schemas.openxmlformats.org/officeDocument/2006/customXml" ds:itemID="{8459E5D0-7ACB-4FF4-B3A2-F80FBCC9791B}">
-  <ds:schemaRefs>
-    <ds:schemaRef ds:uri="http://schemas.openxmlformats.org/officeDocument/2006/bibliography"/>
-  </ds:schemaRefs>
-</ds:datastoreItem>
 </file>
</xml_diff>